<commit_message>
entregable siguiendo las instrucciones de las tecnologias
</commit_message>
<xml_diff>
--- a/Entregable-1/informe/Informe_Entregable_1.docx
+++ b/Entregable-1/informe/Informe_Entregable_1.docx
@@ -105,7 +105,7 @@
           <w:color w:val="000000"/>
           <w:sz w:val="24"/>
         </w:rPr>
-        <w:t>Skill y asistente de IA para la gestión de evidencias y la auditoría interna de un PIMS basado en ISO/IEC 27701:2025</w:t>
+        <w:t>Skill y asistente de IA local para la gestión de evidencias y la auditoría interna de un PIMS basado en ISO/IEC 27701:2025</w:t>
       </w:r>
     </w:p>
     <w:p>
@@ -359,6 +359,23 @@
     </w:p>
     <w:p>
       <w:pPr>
+        <w:spacing w:after="120"/>
+        <w:ind w:left="0"/>
+        <w:jc w:val="both"/>
+      </w:pPr>
+      <w:r>
+        <w:rPr>
+          <w:rFonts w:ascii="Times New Roman" w:hAnsi="Times New Roman" w:eastAsia="Times New Roman"/>
+          <w:b w:val="0"/>
+          <w:i w:val="0"/>
+          <w:color w:val="000000"/>
+          <w:sz w:val="24"/>
+        </w:rPr>
+        <w:t>El asistente se implementó como una aplicación web local con Python y Flask en el servidor, HTML, CSS y JavaScript puro en la interfaz, y un modelo de lenguaje y un modelo de embeddings que se ejecutan en la propia máquina mediante Ollama. Su conocimiento se recupera con búsqueda semántica sobre un índice FAISS. Como las evidencias de un PIMS contienen datos personales, ningún documento ni pregunta sale a un servicio externo.</w:t>
+      </w:r>
+    </w:p>
+    <w:p>
+      <w:pPr>
         <w:pStyle w:val="Heading1"/>
       </w:pPr>
       <w:r>
@@ -401,7 +418,7 @@
           <w:color w:val="000000"/>
           <w:sz w:val="24"/>
         </w:rPr>
-        <w:t>Desarrollar una skill de IA funcional y un asistente especializado que registren, verifiquen y mapeen las evidencias de auditoría de un PIMS contra ISO/IEC 27701:2025 y produzcan hallazgos preliminares de auditoría interna.</w:t>
+        <w:t>Desarrollar una skill de IA funcional y un asistente local especializado que registren, verifiquen y mapeen las evidencias de auditoría de un PIMS contra ISO/IEC 27701:2025 y produzcan hallazgos preliminares de auditoría interna.</w:t>
       </w:r>
     </w:p>
     <w:p>
@@ -524,7 +541,7 @@
           <w:color w:val="000000"/>
           <w:sz w:val="24"/>
         </w:rPr>
-        <w:t>Construir el asistente AUDITA-PIMS definiendo su identidad, sus instrucciones y su base de conocimiento.</w:t>
+        <w:t>Construir el asistente AUDITA-PIMS definiendo su identidad, sus instrucciones y una base de conocimiento recuperada por RAG con embeddings locales y FAISS.</w:t>
       </w:r>
     </w:p>
     <w:p>
@@ -546,7 +563,29 @@
           <w:color w:val="000000"/>
           <w:sz w:val="24"/>
         </w:rPr>
-        <w:t>Validar la skill con un caso de estudio y casos de prueba.</w:t>
+        <w:t>Implementar el asistente como aplicación web (Flask, HTML, CSS y JavaScript puro) con un modelo de lenguaje local.</w:t>
+      </w:r>
+    </w:p>
+    <w:p>
+      <w:pPr>
+        <w:pStyle w:val="ListNumber"/>
+        <w:spacing w:after="60" w:line="240" w:lineRule="auto"/>
+        <w:ind w:left="624" w:hanging="340"/>
+        <w:jc w:val="both"/>
+        <w:numPr>
+          <w:ilvl w:val="0"/>
+          <w:numId w:val="10"/>
+        </w:numPr>
+      </w:pPr>
+      <w:r>
+        <w:rPr>
+          <w:rFonts w:ascii="Times New Roman" w:hAnsi="Times New Roman" w:eastAsia="Times New Roman"/>
+          <w:b w:val="0"/>
+          <w:i w:val="0"/>
+          <w:color w:val="000000"/>
+          <w:sz w:val="24"/>
+        </w:rPr>
+        <w:t>Validar la skill y el asistente con un caso de estudio y casos de prueba.</w:t>
       </w:r>
     </w:p>
     <w:p>
@@ -593,7 +632,7 @@
           <w:color w:val="000000"/>
           <w:sz w:val="24"/>
         </w:rPr>
-        <w:t>Los requisitos obligatorios del PIMS se organizan en las cláusulas 4 a 10 (contexto, liderazgo, planificación, apoyo, operación, evaluación del desempeño y mejora) y en el Anexo A, que agrupa los controles en tres tablas según el rol: A.1 para responsables del tratamiento, A.2 para encargados y A.3 para ambos. La Declaración de Aplicabilidad (SoA) justifica qué controles aplican.</w:t>
+        <w:t>Los requisitos obligatorios del PIMS se organizan en las cláusulas 4 a 10 (contexto, liderazgo, planificación, apoyo, operación, evaluación del desempeño y mejora) y en el Anexo A, que agrupa 78 controles en tres tablas según el rol: A.1 para responsables del tratamiento (31), A.2 para encargados (18) y A.3 para ambos (29). La Declaración de Aplicabilidad (SoA) justifica qué controles aplican.</w:t>
       </w:r>
     </w:p>
     <w:p>
@@ -820,7 +859,7 @@
                 <w:color w:val="000000"/>
                 <w:sz w:val="24"/>
               </w:rPr>
-              <w:t>Paquete con instrucciones (SKILL.md), scripts y referencias que el modelo carga cuando la descripción coincide con la tarea</w:t>
+              <w:t>Paquete con instrucciones (SKILL.md), scripts y referencias que se carga cuando la descripción coincide con la tarea</w:t>
             </w:r>
           </w:p>
         </w:tc>
@@ -984,6 +1023,21 @@
     </w:p>
     <w:p>
       <w:pPr>
+        <w:pStyle w:val="Heading2"/>
+      </w:pPr>
+      <w:r>
+        <w:rPr>
+          <w:rFonts w:ascii="Times New Roman" w:hAnsi="Times New Roman" w:eastAsia="Times New Roman"/>
+          <w:b/>
+          <w:i w:val="0"/>
+          <w:color w:val="000000"/>
+          <w:sz w:val="24"/>
+        </w:rPr>
+        <w:t>3.3. RAG, embeddings y modelos locales</w:t>
+      </w:r>
+    </w:p>
+    <w:p>
+      <w:pPr>
         <w:spacing w:after="120"/>
         <w:ind w:left="0"/>
         <w:jc w:val="both"/>
@@ -996,7 +1050,41 @@
           <w:color w:val="000000"/>
           <w:sz w:val="24"/>
         </w:rPr>
-        <w:t>Las skills siguen el principio de divulgación progresiva: el modelo solo ve al inicio el nombre y la descripción de cada skill; si la tarea coincide, lee el SKILL.md y, solo cuando lo necesita, los archivos de referencia y los scripts. Por eso la descripción funciona como disparador de activación.</w:t>
+        <w:t>La generación aumentada por recuperación (RAG) conecta un modelo de lenguaje con una base de conocimiento externa: los documentos se dividen en fragmentos, cada fragmento se convierte en un vector (embedding) que representa su significado y los vectores se guardan en un índice. Ante una pregunta, se calcula su vector, se recuperan los fragmentos más parecidos y se entregan al modelo como contexto, de modo que responde con información verificable y citable en lugar de hacerlo de memoria.</w:t>
+      </w:r>
+    </w:p>
+    <w:p>
+      <w:pPr>
+        <w:spacing w:after="120"/>
+        <w:ind w:left="0"/>
+        <w:jc w:val="both"/>
+      </w:pPr>
+      <w:r>
+        <w:rPr>
+          <w:rFonts w:ascii="Times New Roman" w:hAnsi="Times New Roman" w:eastAsia="Times New Roman"/>
+          <w:b w:val="0"/>
+          <w:i w:val="0"/>
+          <w:color w:val="000000"/>
+          <w:sz w:val="24"/>
+        </w:rPr>
+        <w:t>FAISS es una biblioteca de búsqueda de similitud entre vectores. El asistente usa un índice exacto de producto interno sobre vectores normalizados, que equivale a la similitud coseno. Los embeddings los produce nomic-embed-text y las respuestas el modelo Qwen 2.5 de 7 000 millones de parámetros, ambos servidos por Ollama en la máquina del auditor.</w:t>
+      </w:r>
+    </w:p>
+    <w:p>
+      <w:pPr>
+        <w:spacing w:after="120"/>
+        <w:ind w:left="0"/>
+        <w:jc w:val="both"/>
+      </w:pPr>
+      <w:r>
+        <w:rPr>
+          <w:rFonts w:ascii="Times New Roman" w:hAnsi="Times New Roman" w:eastAsia="Times New Roman"/>
+          <w:b w:val="0"/>
+          <w:i w:val="0"/>
+          <w:color w:val="000000"/>
+          <w:sz w:val="24"/>
+        </w:rPr>
+        <w:t>La necesidad del RAG se comprobó al instalar el modelo: preguntado sin contexto qué es un PIMS, respondió con seguridad que significa «Problema de Inversión Mínima de Capital», una definición inventada. Con la base de conocimiento recuperada por FAISS el mismo modelo responde dentro del marco de ISO/IEC 27701.</w:t>
       </w:r>
     </w:p>
     <w:p>
@@ -1033,19 +1121,43 @@
     </w:p>
     <w:p>
       <w:pPr>
-        <w:spacing w:after="120"/>
-        <w:ind w:left="0"/>
-        <w:jc w:val="both"/>
+        <w:keepNext/>
+        <w:spacing w:before="120" w:after="60"/>
+        <w:jc w:val="center"/>
       </w:pPr>
       <w:r>
-        <w:rPr>
-          <w:rFonts w:ascii="Times New Roman" w:hAnsi="Times New Roman" w:eastAsia="Times New Roman"/>
-          <w:b w:val="0"/>
-          <w:i w:val="0"/>
-          <w:color w:val="C00000"/>
-          <w:sz w:val="24"/>
-        </w:rPr>
-        <w:t>[Figura pendiente de generar. Guardar como informe/figuras/arquitectura.png. Prompt:] Diagrama de arquitectura plano, fondo blanco, sin sombras ni degradados, rotulos en espanol, proporcion 16:9. Arriba, una franja ancha titulada Capa de gobernanza con tres cajas: Orquestador, Registro de decisiones y Panel de aprobacion humana (DPO / auditor). Debajo, una franja titulada Bus MCP. Debajo, la capa de agentes con ocho cajas en dos filas de cuatro: Inventario de datos, Evaluacion de riesgos, Controles y SoA, Evidencia y Auditoria; Derechos (DSAR), Incidentes y brechas, Terceros (DPA), Formacion y conciencia. La caja Evidencia y Auditoria va con borde negro grueso y el rotulo Grupo 6; las otras siete con borde gris fino. Flechas grises finas desde las otras siete cajas hacia Evidencia y Auditoria con la etiqueta evidencias. Abajo, la capa de herramientas con cuatro cajas: PostgreSQL PII, Expediente de evidencias (registro_evidencias.json, cadena_custodia.log), Catalogo controles_27701.json y LLM. Una flecha de Evidencia y Auditoria hacia Panel de aprobacion humana con la etiqueta hallazgos preliminares. Solo negro y grises.</w:t>
+        <w:drawing>
+          <wp:inline xmlns:a="http://schemas.openxmlformats.org/drawingml/2006/main" xmlns:pic="http://schemas.openxmlformats.org/drawingml/2006/picture">
+            <wp:extent cx="5356800" cy="3236635"/>
+            <wp:docPr id="1" name="Picture 1"/>
+            <wp:cNvGraphicFramePr>
+              <a:graphicFrameLocks noChangeAspect="1"/>
+            </wp:cNvGraphicFramePr>
+            <a:graphic>
+              <a:graphicData uri="http://schemas.openxmlformats.org/drawingml/2006/picture">
+                <pic:pic>
+                  <pic:nvPicPr>
+                    <pic:cNvPr id="0" name="arquitectura.png"/>
+                    <pic:cNvPicPr/>
+                  </pic:nvPicPr>
+                  <pic:blipFill>
+                    <a:blip r:embed="rId9"/>
+                    <a:stretch>
+                      <a:fillRect/>
+                    </a:stretch>
+                  </pic:blipFill>
+                  <pic:spPr>
+                    <a:xfrm>
+                      <a:off x="0" y="0"/>
+                      <a:ext cx="5356800" cy="3236635"/>
+                    </a:xfrm>
+                    <a:prstGeom prst="rect"/>
+                  </pic:spPr>
+                </pic:pic>
+              </a:graphicData>
+            </a:graphic>
+          </wp:inline>
+        </w:drawing>
       </w:r>
     </w:p>
     <w:p>
@@ -1087,7 +1199,7 @@
           <w:color w:val="000000"/>
           <w:sz w:val="24"/>
         </w:rPr>
-        <w:t>Para el primer entregable el agente se construye como skill más asistente; su conversión en agente autónomo conectado al orquestador y a PostgreSQL es objeto del segundo entregable.</w:t>
+        <w:t>En este primer entregable el agente se construye como skill más asistente; su conversión en agente autónomo conectado al orquestador y a PostgreSQL es objeto del segundo entregable.</w:t>
       </w:r>
     </w:p>
     <w:p>
@@ -1134,7 +1246,7 @@
           <w:color w:val="000000"/>
           <w:sz w:val="24"/>
         </w:rPr>
-        <w:t>La tarea se resolvía antes con un prompt como el siguiente:</w:t>
+        <w:t>Sin una skill, la tarea se resuelve con un prompt como el siguiente:</w:t>
       </w:r>
     </w:p>
     <w:p>
@@ -1749,7 +1861,7 @@
           <w:color w:val="000000"/>
           <w:sz w:val="24"/>
         </w:rPr>
-        <w:t>La decisión central fue separar lo que debe salir siempre igual —hashes, fechas, conteos y porcentajes—, que pasa a un script, de lo que requiere criterio —decidir a qué control responde un documento, si realmente lo demuestra y cómo redactar el hallazgo—, que queda en el modelo pero acotado por reglas y plantillas.</w:t>
+        <w:t>La decisión central fue separar lo que debe salir siempre igual —hashes, fechas, conteos, porcentajes y reglas de clasificación—, que pasa a código, de lo que requiere criterio —decidir a qué control responde un documento y redactar el hallazgo—, que queda en el modelo pero acotado por reglas, plantillas y el contexto que le entrega la aplicación.</w:t>
       </w:r>
     </w:p>
     <w:tbl>
@@ -2286,7 +2398,7 @@
                 <w:color w:val="000000"/>
                 <w:sz w:val="24"/>
               </w:rPr>
-              <w:t>Script + revisión del modelo</w:t>
+              <w:t>Script + revisión de pertinencia</w:t>
             </w:r>
           </w:p>
         </w:tc>
@@ -2534,6 +2646,21 @@
     </w:p>
     <w:p>
       <w:pPr>
+        <w:pStyle w:val="Heading2"/>
+      </w:pPr>
+      <w:r>
+        <w:rPr>
+          <w:rFonts w:ascii="Times New Roman" w:hAnsi="Times New Roman" w:eastAsia="Times New Roman"/>
+          <w:b/>
+          <w:i w:val="0"/>
+          <w:color w:val="000000"/>
+          <w:sz w:val="24"/>
+        </w:rPr>
+        <w:t>5.3. Del prompt a acciones</w:t>
+      </w:r>
+    </w:p>
+    <w:p>
+      <w:pPr>
         <w:spacing w:after="120"/>
         <w:ind w:left="0"/>
         <w:jc w:val="both"/>
@@ -2546,8 +2673,300 @@
           <w:color w:val="000000"/>
           <w:sz w:val="24"/>
         </w:rPr>
-        <w:t>Con la skill instalada, el mismo encargo se reduce a «prepara la auditoría interna del PIMS con las evidencias de esta carpeta, rol responsable»: el usuario ya no explica cómo revisar, porque el procedimiento vive en la skill.</w:t>
+        <w:t>Con la skill, el usuario ya no explica cómo revisar: en la aplicación cada paso es una acción y el procedimiento vive en el código y en las instrucciones.</w:t>
       </w:r>
+    </w:p>
+    <w:tbl>
+      <w:tblPr>
+        <w:tblW w:type="auto" w:w="0"/>
+        <w:jc w:val="center"/>
+        <w:tblLayout w:type="fixed"/>
+        <w:tblLook w:firstColumn="1" w:firstRow="1" w:lastColumn="0" w:lastRow="0" w:noHBand="0" w:noVBand="1" w:val="04A0"/>
+        <w:tblBorders>
+          <w:top w:val="single" w:sz="4" w:space="0" w:color="auto"/>
+          <w:left w:val="single" w:sz="4" w:space="0" w:color="auto"/>
+          <w:bottom w:val="single" w:sz="4" w:space="0" w:color="auto"/>
+          <w:right w:val="single" w:sz="4" w:space="0" w:color="auto"/>
+          <w:insideH w:val="single" w:sz="4" w:space="0" w:color="auto"/>
+          <w:insideV w:val="single" w:sz="4" w:space="0" w:color="auto"/>
+        </w:tblBorders>
+      </w:tblPr>
+      <w:tblGrid>
+        <w:gridCol w:w="4536"/>
+        <w:gridCol w:w="4536"/>
+      </w:tblGrid>
+      <w:tr>
+        <w:trPr>
+          <w:tblHeader w:val="true"/>
+        </w:trPr>
+        <w:tc>
+          <w:tcPr>
+            <w:tcW w:type="dxa" w:w="2551"/>
+          </w:tcPr>
+          <w:p>
+            <w:pPr>
+              <w:spacing w:before="0" w:after="0" w:line="240" w:lineRule="auto"/>
+              <w:jc w:val="left"/>
+            </w:pPr>
+            <w:r>
+              <w:rPr>
+                <w:rFonts w:ascii="Times New Roman" w:hAnsi="Times New Roman" w:eastAsia="Times New Roman"/>
+                <w:b/>
+                <w:i w:val="0"/>
+                <w:color w:val="000000"/>
+                <w:sz w:val="24"/>
+              </w:rPr>
+              <w:t>Paso de la skill</w:t>
+            </w:r>
+          </w:p>
+        </w:tc>
+        <w:tc>
+          <w:tcPr>
+            <w:tcW w:type="dxa" w:w="6520"/>
+          </w:tcPr>
+          <w:p>
+            <w:pPr>
+              <w:spacing w:before="0" w:after="0" w:line="240" w:lineRule="auto"/>
+              <w:jc w:val="left"/>
+            </w:pPr>
+            <w:r>
+              <w:rPr>
+                <w:rFonts w:ascii="Times New Roman" w:hAnsi="Times New Roman" w:eastAsia="Times New Roman"/>
+                <w:b/>
+                <w:i w:val="0"/>
+                <w:color w:val="000000"/>
+                <w:sz w:val="24"/>
+              </w:rPr>
+              <w:t>Acción en AUDITA-PIMS</w:t>
+            </w:r>
+          </w:p>
+        </w:tc>
+      </w:tr>
+      <w:tr>
+        <w:tc>
+          <w:tcPr>
+            <w:tcW w:type="dxa" w:w="2551"/>
+          </w:tcPr>
+          <w:p>
+            <w:pPr>
+              <w:spacing w:before="0" w:after="0" w:line="240" w:lineRule="auto"/>
+              <w:jc w:val="left"/>
+            </w:pPr>
+            <w:r>
+              <w:rPr>
+                <w:rFonts w:ascii="Times New Roman" w:hAnsi="Times New Roman" w:eastAsia="Times New Roman"/>
+                <w:b w:val="0"/>
+                <w:i w:val="0"/>
+                <w:color w:val="000000"/>
+                <w:sz w:val="24"/>
+              </w:rPr>
+              <w:t>2. Clasificar y registrar</w:t>
+            </w:r>
+          </w:p>
+        </w:tc>
+        <w:tc>
+          <w:tcPr>
+            <w:tcW w:type="dxa" w:w="6520"/>
+          </w:tcPr>
+          <w:p>
+            <w:pPr>
+              <w:spacing w:before="0" w:after="0" w:line="240" w:lineRule="auto"/>
+              <w:jc w:val="left"/>
+            </w:pPr>
+            <w:r>
+              <w:rPr>
+                <w:rFonts w:ascii="Times New Roman" w:hAnsi="Times New Roman" w:eastAsia="Times New Roman"/>
+                <w:b w:val="0"/>
+                <w:i w:val="0"/>
+                <w:color w:val="000000"/>
+                <w:sz w:val="24"/>
+              </w:rPr>
+              <w:t>Subir el archivo, «Analizar con IA local», revisar la propuesta y «Registrar con hash»</w:t>
+            </w:r>
+          </w:p>
+        </w:tc>
+      </w:tr>
+      <w:tr>
+        <w:tc>
+          <w:tcPr>
+            <w:tcW w:type="dxa" w:w="2551"/>
+          </w:tcPr>
+          <w:p>
+            <w:pPr>
+              <w:spacing w:before="0" w:after="0" w:line="240" w:lineRule="auto"/>
+              <w:jc w:val="left"/>
+            </w:pPr>
+            <w:r>
+              <w:rPr>
+                <w:rFonts w:ascii="Times New Roman" w:hAnsi="Times New Roman" w:eastAsia="Times New Roman"/>
+                <w:b w:val="0"/>
+                <w:i w:val="0"/>
+                <w:color w:val="000000"/>
+                <w:sz w:val="24"/>
+              </w:rPr>
+              <w:t>3. Verificar integridad</w:t>
+            </w:r>
+          </w:p>
+        </w:tc>
+        <w:tc>
+          <w:tcPr>
+            <w:tcW w:type="dxa" w:w="6520"/>
+          </w:tcPr>
+          <w:p>
+            <w:pPr>
+              <w:spacing w:before="0" w:after="0" w:line="240" w:lineRule="auto"/>
+              <w:jc w:val="left"/>
+            </w:pPr>
+            <w:r>
+              <w:rPr>
+                <w:rFonts w:ascii="Times New Roman" w:hAnsi="Times New Roman" w:eastAsia="Times New Roman"/>
+                <w:b w:val="0"/>
+                <w:i w:val="0"/>
+                <w:color w:val="000000"/>
+                <w:sz w:val="24"/>
+              </w:rPr>
+              <w:t>Botón «Verificar integridad» y alerta permanente si algo falla</w:t>
+            </w:r>
+          </w:p>
+        </w:tc>
+      </w:tr>
+      <w:tr>
+        <w:tc>
+          <w:tcPr>
+            <w:tcW w:type="dxa" w:w="2551"/>
+          </w:tcPr>
+          <w:p>
+            <w:pPr>
+              <w:spacing w:before="0" w:after="0" w:line="240" w:lineRule="auto"/>
+              <w:jc w:val="left"/>
+            </w:pPr>
+            <w:r>
+              <w:rPr>
+                <w:rFonts w:ascii="Times New Roman" w:hAnsi="Times New Roman" w:eastAsia="Times New Roman"/>
+                <w:b w:val="0"/>
+                <w:i w:val="0"/>
+                <w:color w:val="000000"/>
+                <w:sz w:val="24"/>
+              </w:rPr>
+              <w:t>4. Matriz de cobertura</w:t>
+            </w:r>
+          </w:p>
+        </w:tc>
+        <w:tc>
+          <w:tcPr>
+            <w:tcW w:type="dxa" w:w="6520"/>
+          </w:tcPr>
+          <w:p>
+            <w:pPr>
+              <w:spacing w:before="0" w:after="0" w:line="240" w:lineRule="auto"/>
+              <w:jc w:val="left"/>
+            </w:pPr>
+            <w:r>
+              <w:rPr>
+                <w:rFonts w:ascii="Times New Roman" w:hAnsi="Times New Roman" w:eastAsia="Times New Roman"/>
+                <w:b w:val="0"/>
+                <w:i w:val="0"/>
+                <w:color w:val="000000"/>
+                <w:sz w:val="24"/>
+              </w:rPr>
+              <w:t>Pestaña Cobertura con rol, vigencia y fecha de corte</w:t>
+            </w:r>
+          </w:p>
+        </w:tc>
+      </w:tr>
+      <w:tr>
+        <w:tc>
+          <w:tcPr>
+            <w:tcW w:type="dxa" w:w="2551"/>
+          </w:tcPr>
+          <w:p>
+            <w:pPr>
+              <w:spacing w:before="0" w:after="0" w:line="240" w:lineRule="auto"/>
+              <w:jc w:val="left"/>
+            </w:pPr>
+            <w:r>
+              <w:rPr>
+                <w:rFonts w:ascii="Times New Roman" w:hAnsi="Times New Roman" w:eastAsia="Times New Roman"/>
+                <w:b w:val="0"/>
+                <w:i w:val="0"/>
+                <w:color w:val="000000"/>
+                <w:sz w:val="24"/>
+              </w:rPr>
+              <w:t>5. Hallazgos</w:t>
+            </w:r>
+          </w:p>
+        </w:tc>
+        <w:tc>
+          <w:tcPr>
+            <w:tcW w:type="dxa" w:w="6520"/>
+          </w:tcPr>
+          <w:p>
+            <w:pPr>
+              <w:spacing w:before="0" w:after="0" w:line="240" w:lineRule="auto"/>
+              <w:jc w:val="left"/>
+            </w:pPr>
+            <w:r>
+              <w:rPr>
+                <w:rFonts w:ascii="Times New Roman" w:hAnsi="Times New Roman" w:eastAsia="Times New Roman"/>
+                <w:b w:val="0"/>
+                <w:i w:val="0"/>
+                <w:color w:val="000000"/>
+                <w:sz w:val="24"/>
+              </w:rPr>
+              <w:t>Botón «Redactar hallazgo» en cada control no cubierto</w:t>
+            </w:r>
+          </w:p>
+        </w:tc>
+      </w:tr>
+      <w:tr>
+        <w:tc>
+          <w:tcPr>
+            <w:tcW w:type="dxa" w:w="2551"/>
+          </w:tcPr>
+          <w:p>
+            <w:pPr>
+              <w:spacing w:before="0" w:after="0" w:line="240" w:lineRule="auto"/>
+              <w:jc w:val="left"/>
+            </w:pPr>
+            <w:r>
+              <w:rPr>
+                <w:rFonts w:ascii="Times New Roman" w:hAnsi="Times New Roman" w:eastAsia="Times New Roman"/>
+                <w:b w:val="0"/>
+                <w:i w:val="0"/>
+                <w:color w:val="000000"/>
+                <w:sz w:val="24"/>
+              </w:rPr>
+              <w:t>Consultas libres</w:t>
+            </w:r>
+          </w:p>
+        </w:tc>
+        <w:tc>
+          <w:tcPr>
+            <w:tcW w:type="dxa" w:w="6520"/>
+          </w:tcPr>
+          <w:p>
+            <w:pPr>
+              <w:spacing w:before="0" w:after="0" w:line="240" w:lineRule="auto"/>
+              <w:jc w:val="left"/>
+            </w:pPr>
+            <w:r>
+              <w:rPr>
+                <w:rFonts w:ascii="Times New Roman" w:hAnsi="Times New Roman" w:eastAsia="Times New Roman"/>
+                <w:b w:val="0"/>
+                <w:i w:val="0"/>
+                <w:color w:val="000000"/>
+                <w:sz w:val="24"/>
+              </w:rPr>
+              <w:t>Pestaña Asistente (RAG + modelo local)</w:t>
+            </w:r>
+          </w:p>
+        </w:tc>
+      </w:tr>
+    </w:tbl>
+    <w:p>
+      <w:pPr>
+        <w:spacing w:before="0" w:after="0" w:line="120" w:lineRule="exact"/>
+      </w:pPr>
     </w:p>
     <w:p>
       <w:pPr>
@@ -2593,7 +3012,7 @@
           <w:color w:val="000000"/>
           <w:sz w:val="24"/>
         </w:rPr>
-        <w:t>La activación depende del encabezado YAML del SKILL.md. El nombre identifica la skill y la descripción enumera tanto lo que hace como las frases con que un usuario pediría esa tarea, de modo que el modelo la cargue sin que se la nombren:</w:t>
+        <w:t>La skill sigue el formato de Agent Skills. Su activación depende del encabezado YAML del SKILL.md: el nombre la identifica y la descripción enumera lo que hace y las frases con que un usuario pediría esa tarea, de modo que un asistente compatible la cargue sin que se la nombren. En la aplicación web la activación es explícita: cada acción de la interfaz ejecuta el paso correspondiente.</w:t>
       </w:r>
     </w:p>
     <w:p>
@@ -3187,7 +3606,7 @@
                 <w:color w:val="000000"/>
                 <w:sz w:val="24"/>
               </w:rPr>
-              <w:t>CLI de unas 340 líneas, solo biblioteca estándar de Python</w:t>
+              <w:t>Línea de comandos y biblioteca, solo con la biblioteca estándar de Python</w:t>
             </w:r>
           </w:p>
         </w:tc>
@@ -3208,7 +3627,7 @@
                 <w:color w:val="000000"/>
                 <w:sz w:val="24"/>
               </w:rPr>
-              <w:t>Sin dependencias ni servicios externos: las evidencias con PII no salen de la organización</w:t>
+              <w:t>La aplicación web importa el mismo código: una sola implementación</w:t>
             </w:r>
           </w:p>
         </w:tc>
@@ -3273,7 +3692,7 @@
                 <w:color w:val="000000"/>
                 <w:sz w:val="24"/>
               </w:rPr>
-              <w:t>Ampliable sin tocar código; numeración del Anexo A contrastada con la lista oficial de 78 controles</w:t>
+              <w:t>Ampliable sin tocar código; numeración contrastada con la lista oficial de 78 controles</w:t>
             </w:r>
           </w:p>
         </w:tc>
@@ -3428,7 +3847,7 @@
           <w:color w:val="000000"/>
           <w:sz w:val="24"/>
         </w:rPr>
-        <w:t>Las 16 referencias del Anexo A del catálogo se contrastaron con la lista publicada de los 78 controles de la edición 2025 (31 en A.1, 18 en A.2 y 29 en A.3) y coinciden en numeración. Se corrigieron cuatro títulos de la tabla A.3 (A.3.11, A.3.12, A.3.17 y A.3.18), que la norma formula en términos de seguridad de la información y no de privacidad. Los títulos están traducidos al español por el grupo; ante una auditoría real prevalece el texto oficial de la norma.</w:t>
+        <w:t>Las 16 referencias del Anexo A del catálogo se contrastaron con la lista publicada de los 78 controles de la edición 2025 y coinciden en numeración. Los títulos de la tabla A.3 se formulan, como en la norma, en términos de seguridad de la información. Los títulos están traducidos al español por el grupo; ante una auditoría real prevalece el texto oficial.</w:t>
       </w:r>
     </w:p>
     <w:p>
@@ -3465,19 +3884,43 @@
     </w:p>
     <w:p>
       <w:pPr>
-        <w:spacing w:after="120"/>
-        <w:ind w:left="0"/>
-        <w:jc w:val="both"/>
+        <w:keepNext/>
+        <w:spacing w:before="120" w:after="60"/>
+        <w:jc w:val="center"/>
       </w:pPr>
       <w:r>
-        <w:rPr>
-          <w:rFonts w:ascii="Times New Roman" w:hAnsi="Times New Roman" w:eastAsia="Times New Roman"/>
-          <w:b w:val="0"/>
-          <w:i w:val="0"/>
-          <w:color w:val="C00000"/>
-          <w:sz w:val="24"/>
-        </w:rPr>
-        <w:t>[Figura pendiente de generar. Guardar como informe/figuras/flujo_skill.png. Prompt:] Diagrama de flujo vertical plano, fondo blanco, sin sombras ni degradados, rotulos en espanol, proporcion 3:4. Seis cajas numeradas de arriba abajo unidas por flechas: 1 Entender el encargo (rol y periodo); 2 Clasificar y registrar (evidencia.py registrar, SHA-256); 3 Verificar integridad (evidencia.py verificar); 4 Matriz de cobertura (evidencia.py cobertura + revision de pertinencia); 5 Hallazgos preliminares (plantilla_hallazgo.md); 6 Entregar al auditor. A la izquierda de cada caja una etiqueta pequena: Modelo para 1, 5 y 6; Script para 3; Modelo + Script para 2 y 4. Desde el paso 1 salen tres flechas finas que saltan al paso 2, al paso 3 y al paso 5 segun el tipo de encargo. A la derecha, una columna con los archivos que lee cada paso: controles_27701.json en 2 y 4, criterios_evidencia.md en 4 y 5. Al pie, un rombo Validacion del auditor humano. Solo negro y grises.</w:t>
+        <w:drawing>
+          <wp:inline xmlns:a="http://schemas.openxmlformats.org/drawingml/2006/main" xmlns:pic="http://schemas.openxmlformats.org/drawingml/2006/picture">
+            <wp:extent cx="4140000" cy="5224767"/>
+            <wp:docPr id="2" name="Picture 2"/>
+            <wp:cNvGraphicFramePr>
+              <a:graphicFrameLocks noChangeAspect="1"/>
+            </wp:cNvGraphicFramePr>
+            <a:graphic>
+              <a:graphicData uri="http://schemas.openxmlformats.org/drawingml/2006/picture">
+                <pic:pic>
+                  <pic:nvPicPr>
+                    <pic:cNvPr id="0" name="flujo_skill.png"/>
+                    <pic:cNvPicPr/>
+                  </pic:nvPicPr>
+                  <pic:blipFill>
+                    <a:blip r:embed="rId10"/>
+                    <a:stretch>
+                      <a:fillRect/>
+                    </a:stretch>
+                  </pic:blipFill>
+                  <pic:spPr>
+                    <a:xfrm>
+                      <a:off x="0" y="0"/>
+                      <a:ext cx="4140000" cy="5224767"/>
+                    </a:xfrm>
+                    <a:prstGeom prst="rect"/>
+                  </pic:spPr>
+                </pic:pic>
+              </a:graphicData>
+            </a:graphic>
+          </wp:inline>
+        </w:drawing>
       </w:r>
     </w:p>
     <w:p>
@@ -3529,7 +3972,7 @@
           <w:color w:val="000000"/>
           <w:sz w:val="24"/>
         </w:rPr>
-        <w:t xml:space="preserve"> El modelo identifica si se trata de registrar, verificar, evaluar la auditoría o redactar hallazgos, y salta al paso que corresponda. Si falta el rol o el periodo pregunta una sola vez y, si no hay respuesta, asume ambos roles y doce meses, dejándolo escrito.</w:t>
+        <w:t xml:space="preserve"> Se identifica si se trata de registrar, verificar, evaluar la auditoría o redactar hallazgos. Si falta el rol o el periodo se pregunta una sola vez y, si no hay respuesta, se asumen ambos roles y doce meses, dejándolo escrito.</w:t>
       </w:r>
     </w:p>
     <w:p>
@@ -3556,7 +3999,7 @@
           <w:color w:val="000000"/>
           <w:sz w:val="24"/>
         </w:rPr>
-        <w:t xml:space="preserve"> El modelo lee el archivo y decide a qué control responde comparándolo con el campo evidencia_esperada del catálogo. El script copia el archivo al expediente, calcula su SHA-256, rechaza duplicados y controles inexistentes, asigna un ID correlativo y añade una línea a la cadena de custodia:</w:t>
+        <w:t xml:space="preserve"> Se lee el archivo y se decide a qué control responde comparándolo con el campo evidencia_esperada del catálogo. El script copia el archivo al expediente, calcula su SHA-256, rechaza duplicados y controles inexistentes, asigna un ID correlativo y añade una línea a la cadena de custodia:</w:t>
       </w:r>
     </w:p>
     <w:p>
@@ -4070,7 +4513,7 @@
           <w:color w:val="000000"/>
           <w:sz w:val="24"/>
         </w:rPr>
-        <w:t>Después, el modelo abre al menos una evidencia de cada control cubierto y confirma que lo demuestra; si no, lo degrada a Parcial y explica el motivo. Es el punto donde el modelo aporta lo que el script no puede.</w:t>
+        <w:t>Después se revisa la pertinencia: se abre al menos una evidencia de cada control cubierto y se confirma que lo demuestra; si no, se degrada a Parcial y se explica el motivo.</w:t>
       </w:r>
     </w:p>
     <w:p>
@@ -4205,7 +4648,7 @@
           <w:color w:val="000000"/>
           <w:sz w:val="24"/>
         </w:rPr>
-        <w:t>No reproducir PII en las respuestas; describirla de forma agregada.</w:t>
+        <w:t>No reproducir PII en las respuestas ni calcular cifras que el script no haya calculado.</w:t>
       </w:r>
     </w:p>
     <w:p>
@@ -4328,7 +4771,7 @@
           <w:color w:val="000000"/>
           <w:sz w:val="24"/>
         </w:rPr>
-        <w:t>Las instrucciones completas están en 03-asistente/instrucciones_sistema.md y se organizan en cuatro bloques:</w:t>
+        <w:t>Las instrucciones están en 03-asistente/instrucciones_sistema.md y la aplicación las envía al modelo local como mensaje de sistema en cada consulta. Se organizan en cinco bloques:</w:t>
       </w:r>
     </w:p>
     <w:tbl>
@@ -4415,6 +4858,94 @@
                 <w:color w:val="000000"/>
                 <w:sz w:val="24"/>
               </w:rPr>
+              <w:t>Identidad</w:t>
+            </w:r>
+          </w:p>
+        </w:tc>
+        <w:tc>
+          <w:tcPr>
+            <w:tcW w:type="dxa" w:w="7087"/>
+          </w:tcPr>
+          <w:p>
+            <w:pPr>
+              <w:spacing w:before="0" w:after="0" w:line="240" w:lineRule="auto"/>
+              <w:jc w:val="left"/>
+            </w:pPr>
+            <w:r>
+              <w:rPr>
+                <w:rFonts w:ascii="Times New Roman" w:hAnsi="Times New Roman" w:eastAsia="Times New Roman"/>
+                <w:b w:val="0"/>
+                <w:i w:val="0"/>
+                <w:color w:val="000000"/>
+                <w:sz w:val="24"/>
+              </w:rPr>
+              <w:t>Rol, destinatarios, misión y tono</w:t>
+            </w:r>
+          </w:p>
+        </w:tc>
+      </w:tr>
+      <w:tr>
+        <w:tc>
+          <w:tcPr>
+            <w:tcW w:type="dxa" w:w="1984"/>
+          </w:tcPr>
+          <w:p>
+            <w:pPr>
+              <w:spacing w:before="0" w:after="0" w:line="240" w:lineRule="auto"/>
+              <w:jc w:val="left"/>
+            </w:pPr>
+            <w:r>
+              <w:rPr>
+                <w:rFonts w:ascii="Times New Roman" w:hAnsi="Times New Roman" w:eastAsia="Times New Roman"/>
+                <w:b w:val="0"/>
+                <w:i w:val="0"/>
+                <w:color w:val="000000"/>
+                <w:sz w:val="24"/>
+              </w:rPr>
+              <w:t>Cómo trabaja</w:t>
+            </w:r>
+          </w:p>
+        </w:tc>
+        <w:tc>
+          <w:tcPr>
+            <w:tcW w:type="dxa" w:w="7087"/>
+          </w:tcPr>
+          <w:p>
+            <w:pPr>
+              <w:spacing w:before="0" w:after="0" w:line="240" w:lineRule="auto"/>
+              <w:jc w:val="left"/>
+            </w:pPr>
+            <w:r>
+              <w:rPr>
+                <w:rFonts w:ascii="Times New Roman" w:hAnsi="Times New Roman" w:eastAsia="Times New Roman"/>
+                <w:b w:val="0"/>
+                <w:i w:val="0"/>
+                <w:color w:val="000000"/>
+                <w:sz w:val="24"/>
+              </w:rPr>
+              <w:t>La aplicación calcula; el modelo recibe los resultados en el bloque CONTEXTO y los copia. El CONTEXTO es su única fuente de verdad</w:t>
+            </w:r>
+          </w:p>
+        </w:tc>
+      </w:tr>
+      <w:tr>
+        <w:tc>
+          <w:tcPr>
+            <w:tcW w:type="dxa" w:w="1984"/>
+          </w:tcPr>
+          <w:p>
+            <w:pPr>
+              <w:spacing w:before="0" w:after="0" w:line="240" w:lineRule="auto"/>
+              <w:jc w:val="left"/>
+            </w:pPr>
+            <w:r>
+              <w:rPr>
+                <w:rFonts w:ascii="Times New Roman" w:hAnsi="Times New Roman" w:eastAsia="Times New Roman"/>
+                <w:b w:val="0"/>
+                <w:i w:val="0"/>
+                <w:color w:val="000000"/>
+                <w:sz w:val="24"/>
+              </w:rPr>
               <w:t>Lo que hace</w:t>
             </w:r>
           </w:p>
@@ -4436,7 +4967,7 @@
                 <w:color w:val="000000"/>
                 <w:sz w:val="24"/>
               </w:rPr>
-              <w:t>Registrar, verificar, construir la matriz, valorar evidencia, redactar hallazgos y explicar requisitos, siempre siguiendo la skill</w:t>
+              <w:t>Clasificar evidencias entre los controles del catálogo, explicar el estado del expediente, valorar evidencia, redactar hallazgos y explicar requisitos</w:t>
             </w:r>
           </w:p>
         </w:tc>
@@ -4480,7 +5011,7 @@
                 <w:color w:val="000000"/>
                 <w:sz w:val="24"/>
               </w:rPr>
-              <w:t>Inventar evidencia o cifras, declarar a la organización certificable, reproducir PII, modificar evidencias, dar asesoría legal vinculante, salirse del PIMS</w:t>
+              <w:t>Inventar evidencia o cifras, aceptar cumplimiento por afirmación, contar registros dentro de una evidencia, declarar a la organización certificable, reproducir PII, dar asesoría legal vinculante, salirse del PIMS</w:t>
             </w:r>
           </w:p>
         </w:tc>
@@ -4524,51 +5055,7 @@
                 <w:color w:val="000000"/>
                 <w:sz w:val="24"/>
               </w:rPr>
-              <w:t>Cita [control · EV-XXXX], una sola pregunta ante ambigüedad, orden fijo de entrega, hallazgos marcados como preliminares</w:t>
-            </w:r>
-          </w:p>
-        </w:tc>
-      </w:tr>
-      <w:tr>
-        <w:tc>
-          <w:tcPr>
-            <w:tcW w:type="dxa" w:w="1984"/>
-          </w:tcPr>
-          <w:p>
-            <w:pPr>
-              <w:spacing w:before="0" w:after="0" w:line="240" w:lineRule="auto"/>
-              <w:jc w:val="left"/>
-            </w:pPr>
-            <w:r>
-              <w:rPr>
-                <w:rFonts w:ascii="Times New Roman" w:hAnsi="Times New Roman" w:eastAsia="Times New Roman"/>
-                <w:b w:val="0"/>
-                <w:i w:val="0"/>
-                <w:color w:val="000000"/>
-                <w:sz w:val="24"/>
-              </w:rPr>
-              <w:t>Conocimiento</w:t>
-            </w:r>
-          </w:p>
-        </w:tc>
-        <w:tc>
-          <w:tcPr>
-            <w:tcW w:type="dxa" w:w="7087"/>
-          </w:tcPr>
-          <w:p>
-            <w:pPr>
-              <w:spacing w:before="0" w:after="0" w:line="240" w:lineRule="auto"/>
-              <w:jc w:val="left"/>
-            </w:pPr>
-            <w:r>
-              <w:rPr>
-                <w:rFonts w:ascii="Times New Roman" w:hAnsi="Times New Roman" w:eastAsia="Times New Roman"/>
-                <w:b w:val="0"/>
-                <w:i w:val="0"/>
-                <w:color w:val="000000"/>
-                <w:sz w:val="24"/>
-              </w:rPr>
-              <w:t>Fuentes en orden de prioridad; los archivos prevalecen sobre el conocimiento general del modelo</w:t>
+              <w:t>Cita [control · EV-XXXX], alerta de integridad primero, hallazgos marcados como preliminares, respuestas breves</w:t>
             </w:r>
           </w:p>
         </w:tc>
@@ -4591,7 +5078,24 @@
           <w:color w:val="000000"/>
           <w:sz w:val="24"/>
         </w:rPr>
-        <w:t>7.3. Conocimiento</w:t>
+        <w:t>7.3. Conocimiento: RAG con embeddings locales y FAISS</w:t>
+      </w:r>
+    </w:p>
+    <w:p>
+      <w:pPr>
+        <w:spacing w:after="120"/>
+        <w:ind w:left="0"/>
+        <w:jc w:val="both"/>
+      </w:pPr>
+      <w:r>
+        <w:rPr>
+          <w:rFonts w:ascii="Times New Roman" w:hAnsi="Times New Roman" w:eastAsia="Times New Roman"/>
+          <w:b w:val="0"/>
+          <w:i w:val="0"/>
+          <w:color w:val="000000"/>
+          <w:sz w:val="24"/>
+        </w:rPr>
+        <w:t>El conocimiento no se pega completo en cada consulta. La aplicación divide las fuentes en fragmentos, los convierte en vectores con nomic-embed-text y los guarda en un índice FAISS de 60 fragmentos. En cada pregunta recupera los seis más parecidos y se los entrega al modelo junto con el estado del expediente calculado por evidencia.py.</w:t>
       </w:r>
     </w:p>
     <w:tbl>
@@ -4610,8 +5114,9 @@
         </w:tblBorders>
       </w:tblPr>
       <w:tblGrid>
-        <w:gridCol w:w="4536"/>
-        <w:gridCol w:w="4536"/>
+        <w:gridCol w:w="3024"/>
+        <w:gridCol w:w="3024"/>
+        <w:gridCol w:w="3024"/>
       </w:tblGrid>
       <w:tr>
         <w:trPr>
@@ -4619,7 +5124,7 @@
         </w:trPr>
         <w:tc>
           <w:tcPr>
-            <w:tcW w:type="dxa" w:w="2551"/>
+            <w:tcW w:type="dxa" w:w="2608"/>
           </w:tcPr>
           <w:p>
             <w:pPr>
@@ -4634,13 +5139,34 @@
                 <w:color w:val="000000"/>
                 <w:sz w:val="24"/>
               </w:rPr>
-              <w:t>Archivo</w:t>
+              <w:t>Fuente indexada</w:t>
             </w:r>
           </w:p>
         </w:tc>
         <w:tc>
           <w:tcPr>
-            <w:tcW w:type="dxa" w:w="6520"/>
+            <w:tcW w:type="dxa" w:w="2381"/>
+          </w:tcPr>
+          <w:p>
+            <w:pPr>
+              <w:spacing w:before="0" w:after="0" w:line="240" w:lineRule="auto"/>
+              <w:jc w:val="left"/>
+            </w:pPr>
+            <w:r>
+              <w:rPr>
+                <w:rFonts w:ascii="Times New Roman" w:hAnsi="Times New Roman" w:eastAsia="Times New Roman"/>
+                <w:b/>
+                <w:i w:val="0"/>
+                <w:color w:val="000000"/>
+                <w:sz w:val="24"/>
+              </w:rPr>
+              <w:t>Fragmentación</w:t>
+            </w:r>
+          </w:p>
+        </w:tc>
+        <w:tc>
+          <w:tcPr>
+            <w:tcW w:type="dxa" w:w="4082"/>
           </w:tcPr>
           <w:p>
             <w:pPr>
@@ -4663,51 +5189,7 @@
       <w:tr>
         <w:tc>
           <w:tcPr>
-            <w:tcW w:type="dxa" w:w="2551"/>
-          </w:tcPr>
-          <w:p>
-            <w:pPr>
-              <w:spacing w:before="0" w:after="0" w:line="240" w:lineRule="auto"/>
-              <w:jc w:val="left"/>
-            </w:pPr>
-            <w:r>
-              <w:rPr>
-                <w:rFonts w:ascii="Times New Roman" w:hAnsi="Times New Roman" w:eastAsia="Times New Roman"/>
-                <w:b w:val="0"/>
-                <w:i w:val="0"/>
-                <w:color w:val="000000"/>
-                <w:sz w:val="24"/>
-              </w:rPr>
-              <w:t>SKILL.md</w:t>
-            </w:r>
-          </w:p>
-        </w:tc>
-        <w:tc>
-          <w:tcPr>
-            <w:tcW w:type="dxa" w:w="6520"/>
-          </w:tcPr>
-          <w:p>
-            <w:pPr>
-              <w:spacing w:before="0" w:after="0" w:line="240" w:lineRule="auto"/>
-              <w:jc w:val="left"/>
-            </w:pPr>
-            <w:r>
-              <w:rPr>
-                <w:rFonts w:ascii="Times New Roman" w:hAnsi="Times New Roman" w:eastAsia="Times New Roman"/>
-                <w:b w:val="0"/>
-                <w:i w:val="0"/>
-                <w:color w:val="000000"/>
-                <w:sz w:val="24"/>
-              </w:rPr>
-              <w:t>Procedimiento de seis pasos y reglas</w:t>
-            </w:r>
-          </w:p>
-        </w:tc>
-      </w:tr>
-      <w:tr>
-        <w:tc>
-          <w:tcPr>
-            <w:tcW w:type="dxa" w:w="2551"/>
+            <w:tcW w:type="dxa" w:w="2608"/>
           </w:tcPr>
           <w:p>
             <w:pPr>
@@ -4728,7 +5210,7 @@
         </w:tc>
         <w:tc>
           <w:tcPr>
-            <w:tcW w:type="dxa" w:w="6520"/>
+            <w:tcW w:type="dxa" w:w="2381"/>
           </w:tcPr>
           <w:p>
             <w:pPr>
@@ -4743,7 +5225,28 @@
                 <w:color w:val="000000"/>
                 <w:sz w:val="24"/>
               </w:rPr>
-              <w:t>Controles, evidencia esperada y mínimos</w:t>
+              <w:t>Uno por control (33)</w:t>
+            </w:r>
+          </w:p>
+        </w:tc>
+        <w:tc>
+          <w:tcPr>
+            <w:tcW w:type="dxa" w:w="4082"/>
+          </w:tcPr>
+          <w:p>
+            <w:pPr>
+              <w:spacing w:before="0" w:after="0" w:line="240" w:lineRule="auto"/>
+              <w:jc w:val="left"/>
+            </w:pPr>
+            <w:r>
+              <w:rPr>
+                <w:rFonts w:ascii="Times New Roman" w:hAnsi="Times New Roman" w:eastAsia="Times New Roman"/>
+                <w:b w:val="0"/>
+                <w:i w:val="0"/>
+                <w:color w:val="000000"/>
+                <w:sz w:val="24"/>
+              </w:rPr>
+              <w:t>Qué exige cada control y qué evidencia espera</w:t>
             </w:r>
           </w:p>
         </w:tc>
@@ -4751,7 +5254,7 @@
       <w:tr>
         <w:tc>
           <w:tcPr>
-            <w:tcW w:type="dxa" w:w="2551"/>
+            <w:tcW w:type="dxa" w:w="2608"/>
           </w:tcPr>
           <w:p>
             <w:pPr>
@@ -4772,7 +5275,7 @@
         </w:tc>
         <w:tc>
           <w:tcPr>
-            <w:tcW w:type="dxa" w:w="6520"/>
+            <w:tcW w:type="dxa" w:w="2381"/>
           </w:tcPr>
           <w:p>
             <w:pPr>
@@ -4787,7 +5290,28 @@
                 <w:color w:val="000000"/>
                 <w:sz w:val="24"/>
               </w:rPr>
-              <w:t>Valoración de evidencia y clasificación de hallazgos</w:t>
+              <w:t>Por sección</w:t>
+            </w:r>
+          </w:p>
+        </w:tc>
+        <w:tc>
+          <w:tcPr>
+            <w:tcW w:type="dxa" w:w="4082"/>
+          </w:tcPr>
+          <w:p>
+            <w:pPr>
+              <w:spacing w:before="0" w:after="0" w:line="240" w:lineRule="auto"/>
+              <w:jc w:val="left"/>
+            </w:pPr>
+            <w:r>
+              <w:rPr>
+                <w:rFonts w:ascii="Times New Roman" w:hAnsi="Times New Roman" w:eastAsia="Times New Roman"/>
+                <w:b w:val="0"/>
+                <w:i w:val="0"/>
+                <w:color w:val="000000"/>
+                <w:sz w:val="24"/>
+              </w:rPr>
+              <w:t>Atributos de la evidencia y clasificación de hallazgos</w:t>
             </w:r>
           </w:p>
         </w:tc>
@@ -4795,7 +5319,7 @@
       <w:tr>
         <w:tc>
           <w:tcPr>
-            <w:tcW w:type="dxa" w:w="2551"/>
+            <w:tcW w:type="dxa" w:w="2608"/>
           </w:tcPr>
           <w:p>
             <w:pPr>
@@ -4816,7 +5340,28 @@
         </w:tc>
         <w:tc>
           <w:tcPr>
-            <w:tcW w:type="dxa" w:w="6520"/>
+            <w:tcW w:type="dxa" w:w="2381"/>
+          </w:tcPr>
+          <w:p>
+            <w:pPr>
+              <w:spacing w:before="0" w:after="0" w:line="240" w:lineRule="auto"/>
+              <w:jc w:val="left"/>
+            </w:pPr>
+            <w:r>
+              <w:rPr>
+                <w:rFonts w:ascii="Times New Roman" w:hAnsi="Times New Roman" w:eastAsia="Times New Roman"/>
+                <w:b w:val="0"/>
+                <w:i w:val="0"/>
+                <w:color w:val="000000"/>
+                <w:sz w:val="24"/>
+              </w:rPr>
+              <w:t>Uno</w:t>
+            </w:r>
+          </w:p>
+        </w:tc>
+        <w:tc>
+          <w:tcPr>
+            <w:tcW w:type="dxa" w:w="4082"/>
           </w:tcPr>
           <w:p>
             <w:pPr>
@@ -4839,7 +5384,72 @@
       <w:tr>
         <w:tc>
           <w:tcPr>
-            <w:tcW w:type="dxa" w:w="2551"/>
+            <w:tcW w:type="dxa" w:w="2608"/>
+          </w:tcPr>
+          <w:p>
+            <w:pPr>
+              <w:spacing w:before="0" w:after="0" w:line="240" w:lineRule="auto"/>
+              <w:jc w:val="left"/>
+            </w:pPr>
+            <w:r>
+              <w:rPr>
+                <w:rFonts w:ascii="Times New Roman" w:hAnsi="Times New Roman" w:eastAsia="Times New Roman"/>
+                <w:b w:val="0"/>
+                <w:i w:val="0"/>
+                <w:color w:val="000000"/>
+                <w:sz w:val="24"/>
+              </w:rPr>
+              <w:t>SKILL.md</w:t>
+            </w:r>
+          </w:p>
+        </w:tc>
+        <w:tc>
+          <w:tcPr>
+            <w:tcW w:type="dxa" w:w="2381"/>
+          </w:tcPr>
+          <w:p>
+            <w:pPr>
+              <w:spacing w:before="0" w:after="0" w:line="240" w:lineRule="auto"/>
+              <w:jc w:val="left"/>
+            </w:pPr>
+            <w:r>
+              <w:rPr>
+                <w:rFonts w:ascii="Times New Roman" w:hAnsi="Times New Roman" w:eastAsia="Times New Roman"/>
+                <w:b w:val="0"/>
+                <w:i w:val="0"/>
+                <w:color w:val="000000"/>
+                <w:sz w:val="24"/>
+              </w:rPr>
+              <w:t>Por sección</w:t>
+            </w:r>
+          </w:p>
+        </w:tc>
+        <w:tc>
+          <w:tcPr>
+            <w:tcW w:type="dxa" w:w="4082"/>
+          </w:tcPr>
+          <w:p>
+            <w:pPr>
+              <w:spacing w:before="0" w:after="0" w:line="240" w:lineRule="auto"/>
+              <w:jc w:val="left"/>
+            </w:pPr>
+            <w:r>
+              <w:rPr>
+                <w:rFonts w:ascii="Times New Roman" w:hAnsi="Times New Roman" w:eastAsia="Times New Roman"/>
+                <w:b w:val="0"/>
+                <w:i w:val="0"/>
+                <w:color w:val="000000"/>
+                <w:sz w:val="24"/>
+              </w:rPr>
+              <w:t>Reglas y pasos</w:t>
+            </w:r>
+          </w:p>
+        </w:tc>
+      </w:tr>
+      <w:tr>
+        <w:tc>
+          <w:tcPr>
+            <w:tcW w:type="dxa" w:w="2608"/>
           </w:tcPr>
           <w:p>
             <w:pPr>
@@ -4860,7 +5470,7 @@
         </w:tc>
         <w:tc>
           <w:tcPr>
-            <w:tcW w:type="dxa" w:w="6520"/>
+            <w:tcW w:type="dxa" w:w="2381"/>
           </w:tcPr>
           <w:p>
             <w:pPr>
@@ -4875,15 +5485,13 @@
                 <w:color w:val="000000"/>
                 <w:sz w:val="24"/>
               </w:rPr>
-              <w:t>Vocabulario: PII, SoA, RoPA, DPIA, ARCO, cadena de custodia, HITL, Ley N.º 29733</w:t>
+              <w:t>Por sección</w:t>
             </w:r>
           </w:p>
         </w:tc>
-      </w:tr>
-      <w:tr>
         <w:tc>
           <w:tcPr>
-            <w:tcW w:type="dxa" w:w="2551"/>
+            <w:tcW w:type="dxa" w:w="4082"/>
           </w:tcPr>
           <w:p>
             <w:pPr>
@@ -4898,13 +5506,15 @@
                 <w:color w:val="000000"/>
                 <w:sz w:val="24"/>
               </w:rPr>
-              <w:t>evidencia.py</w:t>
+              <w:t>Vocabulario: PII, SoA, RoPA, DPIA, ARCO, HITL</w:t>
             </w:r>
           </w:p>
         </w:tc>
+      </w:tr>
+      <w:tr>
         <w:tc>
           <w:tcPr>
-            <w:tcW w:type="dxa" w:w="6520"/>
+            <w:tcW w:type="dxa" w:w="2608"/>
           </w:tcPr>
           <w:p>
             <w:pPr>
@@ -4919,7 +5529,49 @@
                 <w:color w:val="000000"/>
                 <w:sz w:val="24"/>
               </w:rPr>
-              <w:t>Herramienta ejecutable</w:t>
+              <w:t>Evidencias del expediente</w:t>
+            </w:r>
+          </w:p>
+        </w:tc>
+        <w:tc>
+          <w:tcPr>
+            <w:tcW w:type="dxa" w:w="2381"/>
+          </w:tcPr>
+          <w:p>
+            <w:pPr>
+              <w:spacing w:before="0" w:after="0" w:line="240" w:lineRule="auto"/>
+              <w:jc w:val="left"/>
+            </w:pPr>
+            <w:r>
+              <w:rPr>
+                <w:rFonts w:ascii="Times New Roman" w:hAnsi="Times New Roman" w:eastAsia="Times New Roman"/>
+                <w:b w:val="0"/>
+                <w:i w:val="0"/>
+                <w:color w:val="000000"/>
+                <w:sz w:val="24"/>
+              </w:rPr>
+              <w:t>Por párrafos, con su ID</w:t>
+            </w:r>
+          </w:p>
+        </w:tc>
+        <w:tc>
+          <w:tcPr>
+            <w:tcW w:type="dxa" w:w="4082"/>
+          </w:tcPr>
+          <w:p>
+            <w:pPr>
+              <w:spacing w:before="0" w:after="0" w:line="240" w:lineRule="auto"/>
+              <w:jc w:val="left"/>
+            </w:pPr>
+            <w:r>
+              <w:rPr>
+                <w:rFonts w:ascii="Times New Roman" w:hAnsi="Times New Roman" w:eastAsia="Times New Roman"/>
+                <w:b w:val="0"/>
+                <w:i w:val="0"/>
+                <w:color w:val="000000"/>
+                <w:sz w:val="24"/>
+              </w:rPr>
+              <w:t>Contenido real de cada evidencia</w:t>
             </w:r>
           </w:p>
         </w:tc>
@@ -4944,7 +5596,7 @@
           <w:color w:val="000000"/>
           <w:sz w:val="24"/>
         </w:rPr>
-        <w:t>No se incorporó el texto de la norma por estar protegido por derechos de autor; el catálogo resume lo necesario para auditar.</w:t>
+        <w:t>El índice se reconstruye solo cuando cambia alguna fuente, lo que se detecta con una huella SHA-256 de todo lo indexado, y cada evidencia nueva se añade al registrarla. Cuando una pregunta cita evidencias por su ID, se adjunta además su texto completo. No se indexó el texto de la norma por estar protegido por derechos de autor; el catálogo resume lo necesario para auditar.</w:t>
       </w:r>
     </w:p>
     <w:p>
@@ -4959,7 +5611,7 @@
           <w:color w:val="000000"/>
           <w:sz w:val="24"/>
         </w:rPr>
-        <w:t>7.4. Despliegue</w:t>
+        <w:t>7.4. Arquitectura de la aplicación</w:t>
       </w:r>
     </w:p>
     <w:p>
@@ -4976,24 +5628,842 @@
           <w:color w:val="000000"/>
           <w:sz w:val="24"/>
         </w:rPr>
-        <w:t>Se documentan tres opciones en 03-asistente/conocimiento_y_despliegue.md. La recomendada es Claude Code, copiando la carpeta de la skill en .claude/skills/ y las instrucciones en CLAUDE.md, porque es la única en la que el asistente ejecuta el script por sí mismo. Las alternativas son un Claude Project (instrucciones y archivos de conocimiento) o un Gem de Gemini o GPT personalizado; en estas, si no hay ejecución de código, el asistente pide al usuario ejecutar el comando y pegar la salida (Figura 4).</w:t>
+        <w:t>La Figura 3 muestra los componentes. El navegador se comunica con el backend Flask mediante peticiones JSON; Flask usa evidencia.py para todo lo determinista, rag.py para la recuperación y asistente.py para construir el mensaje al modelo. El servidor solo escucha en 127.0.0.1.</w:t>
       </w:r>
     </w:p>
     <w:p>
       <w:pPr>
-        <w:spacing w:after="120"/>
-        <w:ind w:left="0"/>
-        <w:jc w:val="both"/>
-      </w:pPr>
+        <w:keepNext/>
+        <w:spacing w:before="120" w:after="60"/>
+        <w:jc w:val="center"/>
+      </w:pPr>
+      <w:r>
+        <w:drawing>
+          <wp:inline xmlns:a="http://schemas.openxmlformats.org/drawingml/2006/main" xmlns:pic="http://schemas.openxmlformats.org/drawingml/2006/picture">
+            <wp:extent cx="5356800" cy="3029288"/>
+            <wp:docPr id="3" name="Picture 3"/>
+            <wp:cNvGraphicFramePr>
+              <a:graphicFrameLocks noChangeAspect="1"/>
+            </wp:cNvGraphicFramePr>
+            <a:graphic>
+              <a:graphicData uri="http://schemas.openxmlformats.org/drawingml/2006/picture">
+                <pic:pic>
+                  <pic:nvPicPr>
+                    <pic:cNvPr id="0" name="arquitectura_app.png"/>
+                    <pic:cNvPicPr/>
+                  </pic:nvPicPr>
+                  <pic:blipFill>
+                    <a:blip r:embed="rId11"/>
+                    <a:stretch>
+                      <a:fillRect/>
+                    </a:stretch>
+                  </pic:blipFill>
+                  <pic:spPr>
+                    <a:xfrm>
+                      <a:off x="0" y="0"/>
+                      <a:ext cx="5356800" cy="3029288"/>
+                    </a:xfrm>
+                    <a:prstGeom prst="rect"/>
+                  </pic:spPr>
+                </pic:pic>
+              </a:graphicData>
+            </a:graphic>
+          </wp:inline>
+        </w:drawing>
+      </w:r>
+    </w:p>
+    <w:p>
+      <w:pPr>
+        <w:pStyle w:val="Caption"/>
+      </w:pPr>
+      <w:r>
+        <w:rPr>
+          <w:rFonts w:ascii="Times New Roman" w:hAnsi="Times New Roman" w:eastAsia="Times New Roman"/>
+          <w:b/>
+          <w:i w:val="0"/>
+          <w:color w:val="000000"/>
+          <w:sz w:val="24"/>
+        </w:rPr>
+        <w:t xml:space="preserve">Figura 3. </w:t>
+      </w:r>
       <w:r>
         <w:rPr>
           <w:rFonts w:ascii="Times New Roman" w:hAnsi="Times New Roman" w:eastAsia="Times New Roman"/>
           <w:b w:val="0"/>
           <w:i w:val="0"/>
-          <w:color w:val="C00000"/>
+          <w:color w:val="000000"/>
           <w:sz w:val="24"/>
         </w:rPr>
-        <w:t>[Captura pendiente. 1) En claude.ai crear el proyecto AUDITA-PIMS siguiendo 03-asistente/conocimiento_y_despliegue.md, opcion B. 2) Abrir la vista del proyecto donde se ven a la vez las instrucciones y la lista de archivos de conocimiento. 3) Capturar la pagina a 1366 x 768 y guardar como informe/figuras/asistente.png. Opcional: segunda captura de la respuesta al caso de prueba CP-03.]</w:t>
+        <w:t>Arquitectura de la aplicación AUDITA-PIMS: todos los componentes se ejecutan en la máquina del auditor.</w:t>
+      </w:r>
+    </w:p>
+    <w:tbl>
+      <w:tblPr>
+        <w:tblW w:type="auto" w:w="0"/>
+        <w:jc w:val="center"/>
+        <w:tblLayout w:type="fixed"/>
+        <w:tblLook w:firstColumn="1" w:firstRow="1" w:lastColumn="0" w:lastRow="0" w:noHBand="0" w:noVBand="1" w:val="04A0"/>
+        <w:tblBorders>
+          <w:top w:val="single" w:sz="4" w:space="0" w:color="auto"/>
+          <w:left w:val="single" w:sz="4" w:space="0" w:color="auto"/>
+          <w:bottom w:val="single" w:sz="4" w:space="0" w:color="auto"/>
+          <w:right w:val="single" w:sz="4" w:space="0" w:color="auto"/>
+          <w:insideH w:val="single" w:sz="4" w:space="0" w:color="auto"/>
+          <w:insideV w:val="single" w:sz="4" w:space="0" w:color="auto"/>
+        </w:tblBorders>
+      </w:tblPr>
+      <w:tblGrid>
+        <w:gridCol w:w="3024"/>
+        <w:gridCol w:w="3024"/>
+        <w:gridCol w:w="3024"/>
+      </w:tblGrid>
+      <w:tr>
+        <w:trPr>
+          <w:tblHeader w:val="true"/>
+        </w:trPr>
+        <w:tc>
+          <w:tcPr>
+            <w:tcW w:type="dxa" w:w="2041"/>
+          </w:tcPr>
+          <w:p>
+            <w:pPr>
+              <w:spacing w:before="0" w:after="0" w:line="240" w:lineRule="auto"/>
+              <w:jc w:val="left"/>
+            </w:pPr>
+            <w:r>
+              <w:rPr>
+                <w:rFonts w:ascii="Times New Roman" w:hAnsi="Times New Roman" w:eastAsia="Times New Roman"/>
+                <w:b/>
+                <w:i w:val="0"/>
+                <w:color w:val="000000"/>
+                <w:sz w:val="24"/>
+              </w:rPr>
+              <w:t>Tecnología</w:t>
+            </w:r>
+          </w:p>
+        </w:tc>
+        <w:tc>
+          <w:tcPr>
+            <w:tcW w:type="dxa" w:w="2948"/>
+          </w:tcPr>
+          <w:p>
+            <w:pPr>
+              <w:spacing w:before="0" w:after="0" w:line="240" w:lineRule="auto"/>
+              <w:jc w:val="left"/>
+            </w:pPr>
+            <w:r>
+              <w:rPr>
+                <w:rFonts w:ascii="Times New Roman" w:hAnsi="Times New Roman" w:eastAsia="Times New Roman"/>
+                <w:b/>
+                <w:i w:val="0"/>
+                <w:color w:val="000000"/>
+                <w:sz w:val="24"/>
+              </w:rPr>
+              <w:t>Componente</w:t>
+            </w:r>
+          </w:p>
+        </w:tc>
+        <w:tc>
+          <w:tcPr>
+            <w:tcW w:type="dxa" w:w="4082"/>
+          </w:tcPr>
+          <w:p>
+            <w:pPr>
+              <w:spacing w:before="0" w:after="0" w:line="240" w:lineRule="auto"/>
+              <w:jc w:val="left"/>
+            </w:pPr>
+            <w:r>
+              <w:rPr>
+                <w:rFonts w:ascii="Times New Roman" w:hAnsi="Times New Roman" w:eastAsia="Times New Roman"/>
+                <w:b/>
+                <w:i w:val="0"/>
+                <w:color w:val="000000"/>
+                <w:sz w:val="24"/>
+              </w:rPr>
+              <w:t>Función</w:t>
+            </w:r>
+          </w:p>
+        </w:tc>
+      </w:tr>
+      <w:tr>
+        <w:tc>
+          <w:tcPr>
+            <w:tcW w:type="dxa" w:w="2041"/>
+          </w:tcPr>
+          <w:p>
+            <w:pPr>
+              <w:spacing w:before="0" w:after="0" w:line="240" w:lineRule="auto"/>
+              <w:jc w:val="left"/>
+            </w:pPr>
+            <w:r>
+              <w:rPr>
+                <w:rFonts w:ascii="Times New Roman" w:hAnsi="Times New Roman" w:eastAsia="Times New Roman"/>
+                <w:b w:val="0"/>
+                <w:i w:val="0"/>
+                <w:color w:val="000000"/>
+                <w:sz w:val="24"/>
+              </w:rPr>
+              <w:t>Python 3.12</w:t>
+            </w:r>
+          </w:p>
+        </w:tc>
+        <w:tc>
+          <w:tcPr>
+            <w:tcW w:type="dxa" w:w="2948"/>
+          </w:tcPr>
+          <w:p>
+            <w:pPr>
+              <w:spacing w:before="0" w:after="0" w:line="240" w:lineRule="auto"/>
+              <w:jc w:val="left"/>
+            </w:pPr>
+            <w:r>
+              <w:rPr>
+                <w:rFonts w:ascii="Times New Roman" w:hAnsi="Times New Roman" w:eastAsia="Times New Roman"/>
+                <w:b w:val="0"/>
+                <w:i w:val="0"/>
+                <w:color w:val="000000"/>
+                <w:sz w:val="24"/>
+              </w:rPr>
+              <w:t>evidencia.py, rag.py, asistente.py</w:t>
+            </w:r>
+          </w:p>
+        </w:tc>
+        <w:tc>
+          <w:tcPr>
+            <w:tcW w:type="dxa" w:w="4082"/>
+          </w:tcPr>
+          <w:p>
+            <w:pPr>
+              <w:spacing w:before="0" w:after="0" w:line="240" w:lineRule="auto"/>
+              <w:jc w:val="left"/>
+            </w:pPr>
+            <w:r>
+              <w:rPr>
+                <w:rFonts w:ascii="Times New Roman" w:hAnsi="Times New Roman" w:eastAsia="Times New Roman"/>
+                <w:b w:val="0"/>
+                <w:i w:val="0"/>
+                <w:color w:val="000000"/>
+                <w:sz w:val="24"/>
+              </w:rPr>
+              <w:t>Lógica de la skill, del RAG y del asistente</w:t>
+            </w:r>
+          </w:p>
+        </w:tc>
+      </w:tr>
+      <w:tr>
+        <w:tc>
+          <w:tcPr>
+            <w:tcW w:type="dxa" w:w="2041"/>
+          </w:tcPr>
+          <w:p>
+            <w:pPr>
+              <w:spacing w:before="0" w:after="0" w:line="240" w:lineRule="auto"/>
+              <w:jc w:val="left"/>
+            </w:pPr>
+            <w:r>
+              <w:rPr>
+                <w:rFonts w:ascii="Times New Roman" w:hAnsi="Times New Roman" w:eastAsia="Times New Roman"/>
+                <w:b w:val="0"/>
+                <w:i w:val="0"/>
+                <w:color w:val="000000"/>
+                <w:sz w:val="24"/>
+              </w:rPr>
+              <w:t>Flask</w:t>
+            </w:r>
+          </w:p>
+        </w:tc>
+        <w:tc>
+          <w:tcPr>
+            <w:tcW w:type="dxa" w:w="2948"/>
+          </w:tcPr>
+          <w:p>
+            <w:pPr>
+              <w:spacing w:before="0" w:after="0" w:line="240" w:lineRule="auto"/>
+              <w:jc w:val="left"/>
+            </w:pPr>
+            <w:r>
+              <w:rPr>
+                <w:rFonts w:ascii="Times New Roman" w:hAnsi="Times New Roman" w:eastAsia="Times New Roman"/>
+                <w:b w:val="0"/>
+                <w:i w:val="0"/>
+                <w:color w:val="000000"/>
+                <w:sz w:val="24"/>
+              </w:rPr>
+              <w:t>app.py</w:t>
+            </w:r>
+          </w:p>
+        </w:tc>
+        <w:tc>
+          <w:tcPr>
+            <w:tcW w:type="dxa" w:w="4082"/>
+          </w:tcPr>
+          <w:p>
+            <w:pPr>
+              <w:spacing w:before="0" w:after="0" w:line="240" w:lineRule="auto"/>
+              <w:jc w:val="left"/>
+            </w:pPr>
+            <w:r>
+              <w:rPr>
+                <w:rFonts w:ascii="Times New Roman" w:hAnsi="Times New Roman" w:eastAsia="Times New Roman"/>
+                <w:b w:val="0"/>
+                <w:i w:val="0"/>
+                <w:color w:val="000000"/>
+                <w:sz w:val="24"/>
+              </w:rPr>
+              <w:t>Siete rutas JSON: estado, cobertura, verificar, sugerir, registrar, chat, hallazgo</w:t>
+            </w:r>
+          </w:p>
+        </w:tc>
+      </w:tr>
+      <w:tr>
+        <w:tc>
+          <w:tcPr>
+            <w:tcW w:type="dxa" w:w="2041"/>
+          </w:tcPr>
+          <w:p>
+            <w:pPr>
+              <w:spacing w:before="0" w:after="0" w:line="240" w:lineRule="auto"/>
+              <w:jc w:val="left"/>
+            </w:pPr>
+            <w:r>
+              <w:rPr>
+                <w:rFonts w:ascii="Times New Roman" w:hAnsi="Times New Roman" w:eastAsia="Times New Roman"/>
+                <w:b w:val="0"/>
+                <w:i w:val="0"/>
+                <w:color w:val="000000"/>
+                <w:sz w:val="24"/>
+              </w:rPr>
+              <w:t>HTML</w:t>
+            </w:r>
+          </w:p>
+        </w:tc>
+        <w:tc>
+          <w:tcPr>
+            <w:tcW w:type="dxa" w:w="2948"/>
+          </w:tcPr>
+          <w:p>
+            <w:pPr>
+              <w:spacing w:before="0" w:after="0" w:line="240" w:lineRule="auto"/>
+              <w:jc w:val="left"/>
+            </w:pPr>
+            <w:r>
+              <w:rPr>
+                <w:rFonts w:ascii="Times New Roman" w:hAnsi="Times New Roman" w:eastAsia="Times New Roman"/>
+                <w:b w:val="0"/>
+                <w:i w:val="0"/>
+                <w:color w:val="000000"/>
+                <w:sz w:val="24"/>
+              </w:rPr>
+              <w:t>templates/index.html</w:t>
+            </w:r>
+          </w:p>
+        </w:tc>
+        <w:tc>
+          <w:tcPr>
+            <w:tcW w:type="dxa" w:w="4082"/>
+          </w:tcPr>
+          <w:p>
+            <w:pPr>
+              <w:spacing w:before="0" w:after="0" w:line="240" w:lineRule="auto"/>
+              <w:jc w:val="left"/>
+            </w:pPr>
+            <w:r>
+              <w:rPr>
+                <w:rFonts w:ascii="Times New Roman" w:hAnsi="Times New Roman" w:eastAsia="Times New Roman"/>
+                <w:b w:val="0"/>
+                <w:i w:val="0"/>
+                <w:color w:val="000000"/>
+                <w:sz w:val="24"/>
+              </w:rPr>
+              <w:t>Tres pestañas: Expediente, Cobertura, Asistente</w:t>
+            </w:r>
+          </w:p>
+        </w:tc>
+      </w:tr>
+      <w:tr>
+        <w:tc>
+          <w:tcPr>
+            <w:tcW w:type="dxa" w:w="2041"/>
+          </w:tcPr>
+          <w:p>
+            <w:pPr>
+              <w:spacing w:before="0" w:after="0" w:line="240" w:lineRule="auto"/>
+              <w:jc w:val="left"/>
+            </w:pPr>
+            <w:r>
+              <w:rPr>
+                <w:rFonts w:ascii="Times New Roman" w:hAnsi="Times New Roman" w:eastAsia="Times New Roman"/>
+                <w:b w:val="0"/>
+                <w:i w:val="0"/>
+                <w:color w:val="000000"/>
+                <w:sz w:val="24"/>
+              </w:rPr>
+              <w:t>CSS</w:t>
+            </w:r>
+          </w:p>
+        </w:tc>
+        <w:tc>
+          <w:tcPr>
+            <w:tcW w:type="dxa" w:w="2948"/>
+          </w:tcPr>
+          <w:p>
+            <w:pPr>
+              <w:spacing w:before="0" w:after="0" w:line="240" w:lineRule="auto"/>
+              <w:jc w:val="left"/>
+            </w:pPr>
+            <w:r>
+              <w:rPr>
+                <w:rFonts w:ascii="Times New Roman" w:hAnsi="Times New Roman" w:eastAsia="Times New Roman"/>
+                <w:b w:val="0"/>
+                <w:i w:val="0"/>
+                <w:color w:val="000000"/>
+                <w:sz w:val="24"/>
+              </w:rPr>
+              <w:t>static/estilos.css</w:t>
+            </w:r>
+          </w:p>
+        </w:tc>
+        <w:tc>
+          <w:tcPr>
+            <w:tcW w:type="dxa" w:w="4082"/>
+          </w:tcPr>
+          <w:p>
+            <w:pPr>
+              <w:spacing w:before="0" w:after="0" w:line="240" w:lineRule="auto"/>
+              <w:jc w:val="left"/>
+            </w:pPr>
+            <w:r>
+              <w:rPr>
+                <w:rFonts w:ascii="Times New Roman" w:hAnsi="Times New Roman" w:eastAsia="Times New Roman"/>
+                <w:b w:val="0"/>
+                <w:i w:val="0"/>
+                <w:color w:val="000000"/>
+                <w:sz w:val="24"/>
+              </w:rPr>
+              <w:t>Diseño sobrio, insignias por estado, adaptable a móvil</w:t>
+            </w:r>
+          </w:p>
+        </w:tc>
+      </w:tr>
+      <w:tr>
+        <w:tc>
+          <w:tcPr>
+            <w:tcW w:type="dxa" w:w="2041"/>
+          </w:tcPr>
+          <w:p>
+            <w:pPr>
+              <w:spacing w:before="0" w:after="0" w:line="240" w:lineRule="auto"/>
+              <w:jc w:val="left"/>
+            </w:pPr>
+            <w:r>
+              <w:rPr>
+                <w:rFonts w:ascii="Times New Roman" w:hAnsi="Times New Roman" w:eastAsia="Times New Roman"/>
+                <w:b w:val="0"/>
+                <w:i w:val="0"/>
+                <w:color w:val="000000"/>
+                <w:sz w:val="24"/>
+              </w:rPr>
+              <w:t>JavaScript puro</w:t>
+            </w:r>
+          </w:p>
+        </w:tc>
+        <w:tc>
+          <w:tcPr>
+            <w:tcW w:type="dxa" w:w="2948"/>
+          </w:tcPr>
+          <w:p>
+            <w:pPr>
+              <w:spacing w:before="0" w:after="0" w:line="240" w:lineRule="auto"/>
+              <w:jc w:val="left"/>
+            </w:pPr>
+            <w:r>
+              <w:rPr>
+                <w:rFonts w:ascii="Times New Roman" w:hAnsi="Times New Roman" w:eastAsia="Times New Roman"/>
+                <w:b w:val="0"/>
+                <w:i w:val="0"/>
+                <w:color w:val="000000"/>
+                <w:sz w:val="24"/>
+              </w:rPr>
+              <w:t>static/app.js</w:t>
+            </w:r>
+          </w:p>
+        </w:tc>
+        <w:tc>
+          <w:tcPr>
+            <w:tcW w:type="dxa" w:w="4082"/>
+          </w:tcPr>
+          <w:p>
+            <w:pPr>
+              <w:spacing w:before="0" w:after="0" w:line="240" w:lineRule="auto"/>
+              <w:jc w:val="left"/>
+            </w:pPr>
+            <w:r>
+              <w:rPr>
+                <w:rFonts w:ascii="Times New Roman" w:hAnsi="Times New Roman" w:eastAsia="Times New Roman"/>
+                <w:b w:val="0"/>
+                <w:i w:val="0"/>
+                <w:color w:val="000000"/>
+                <w:sz w:val="24"/>
+              </w:rPr>
+              <w:t>Llamadas a la API, formularios, chat y renderizado de Markdown sin frameworks</w:t>
+            </w:r>
+          </w:p>
+        </w:tc>
+      </w:tr>
+      <w:tr>
+        <w:tc>
+          <w:tcPr>
+            <w:tcW w:type="dxa" w:w="2041"/>
+          </w:tcPr>
+          <w:p>
+            <w:pPr>
+              <w:spacing w:before="0" w:after="0" w:line="240" w:lineRule="auto"/>
+              <w:jc w:val="left"/>
+            </w:pPr>
+            <w:r>
+              <w:rPr>
+                <w:rFonts w:ascii="Times New Roman" w:hAnsi="Times New Roman" w:eastAsia="Times New Roman"/>
+                <w:b w:val="0"/>
+                <w:i w:val="0"/>
+                <w:color w:val="000000"/>
+                <w:sz w:val="24"/>
+              </w:rPr>
+              <w:t>FAISS</w:t>
+            </w:r>
+          </w:p>
+        </w:tc>
+        <w:tc>
+          <w:tcPr>
+            <w:tcW w:type="dxa" w:w="2948"/>
+          </w:tcPr>
+          <w:p>
+            <w:pPr>
+              <w:spacing w:before="0" w:after="0" w:line="240" w:lineRule="auto"/>
+              <w:jc w:val="left"/>
+            </w:pPr>
+            <w:r>
+              <w:rPr>
+                <w:rFonts w:ascii="Times New Roman" w:hAnsi="Times New Roman" w:eastAsia="Times New Roman"/>
+                <w:b w:val="0"/>
+                <w:i w:val="0"/>
+                <w:color w:val="000000"/>
+                <w:sz w:val="24"/>
+              </w:rPr>
+              <w:t>IndexFlatIP</w:t>
+            </w:r>
+          </w:p>
+        </w:tc>
+        <w:tc>
+          <w:tcPr>
+            <w:tcW w:type="dxa" w:w="4082"/>
+          </w:tcPr>
+          <w:p>
+            <w:pPr>
+              <w:spacing w:before="0" w:after="0" w:line="240" w:lineRule="auto"/>
+              <w:jc w:val="left"/>
+            </w:pPr>
+            <w:r>
+              <w:rPr>
+                <w:rFonts w:ascii="Times New Roman" w:hAnsi="Times New Roman" w:eastAsia="Times New Roman"/>
+                <w:b w:val="0"/>
+                <w:i w:val="0"/>
+                <w:color w:val="000000"/>
+                <w:sz w:val="24"/>
+              </w:rPr>
+              <w:t>Búsqueda por similitud coseno sobre vectores normalizados</w:t>
+            </w:r>
+          </w:p>
+        </w:tc>
+      </w:tr>
+      <w:tr>
+        <w:tc>
+          <w:tcPr>
+            <w:tcW w:type="dxa" w:w="2041"/>
+          </w:tcPr>
+          <w:p>
+            <w:pPr>
+              <w:spacing w:before="0" w:after="0" w:line="240" w:lineRule="auto"/>
+              <w:jc w:val="left"/>
+            </w:pPr>
+            <w:r>
+              <w:rPr>
+                <w:rFonts w:ascii="Times New Roman" w:hAnsi="Times New Roman" w:eastAsia="Times New Roman"/>
+                <w:b w:val="0"/>
+                <w:i w:val="0"/>
+                <w:color w:val="000000"/>
+                <w:sz w:val="24"/>
+              </w:rPr>
+              <w:t>Modelo local de embeddings</w:t>
+            </w:r>
+          </w:p>
+        </w:tc>
+        <w:tc>
+          <w:tcPr>
+            <w:tcW w:type="dxa" w:w="2948"/>
+          </w:tcPr>
+          <w:p>
+            <w:pPr>
+              <w:spacing w:before="0" w:after="0" w:line="240" w:lineRule="auto"/>
+              <w:jc w:val="left"/>
+            </w:pPr>
+            <w:r>
+              <w:rPr>
+                <w:rFonts w:ascii="Times New Roman" w:hAnsi="Times New Roman" w:eastAsia="Times New Roman"/>
+                <w:b w:val="0"/>
+                <w:i w:val="0"/>
+                <w:color w:val="000000"/>
+                <w:sz w:val="24"/>
+              </w:rPr>
+              <w:t>nomic-embed-text (274 MB)</w:t>
+            </w:r>
+          </w:p>
+        </w:tc>
+        <w:tc>
+          <w:tcPr>
+            <w:tcW w:type="dxa" w:w="4082"/>
+          </w:tcPr>
+          <w:p>
+            <w:pPr>
+              <w:spacing w:before="0" w:after="0" w:line="240" w:lineRule="auto"/>
+              <w:jc w:val="left"/>
+            </w:pPr>
+            <w:r>
+              <w:rPr>
+                <w:rFonts w:ascii="Times New Roman" w:hAnsi="Times New Roman" w:eastAsia="Times New Roman"/>
+                <w:b w:val="0"/>
+                <w:i w:val="0"/>
+                <w:color w:val="000000"/>
+                <w:sz w:val="24"/>
+              </w:rPr>
+              <w:t>Vectores de fragmentos y consultas</w:t>
+            </w:r>
+          </w:p>
+        </w:tc>
+      </w:tr>
+      <w:tr>
+        <w:tc>
+          <w:tcPr>
+            <w:tcW w:type="dxa" w:w="2041"/>
+          </w:tcPr>
+          <w:p>
+            <w:pPr>
+              <w:spacing w:before="0" w:after="0" w:line="240" w:lineRule="auto"/>
+              <w:jc w:val="left"/>
+            </w:pPr>
+            <w:r>
+              <w:rPr>
+                <w:rFonts w:ascii="Times New Roman" w:hAnsi="Times New Roman" w:eastAsia="Times New Roman"/>
+                <w:b w:val="0"/>
+                <w:i w:val="0"/>
+                <w:color w:val="000000"/>
+                <w:sz w:val="24"/>
+              </w:rPr>
+              <w:t>LLM local</w:t>
+            </w:r>
+          </w:p>
+        </w:tc>
+        <w:tc>
+          <w:tcPr>
+            <w:tcW w:type="dxa" w:w="2948"/>
+          </w:tcPr>
+          <w:p>
+            <w:pPr>
+              <w:spacing w:before="0" w:after="0" w:line="240" w:lineRule="auto"/>
+              <w:jc w:val="left"/>
+            </w:pPr>
+            <w:r>
+              <w:rPr>
+                <w:rFonts w:ascii="Times New Roman" w:hAnsi="Times New Roman" w:eastAsia="Times New Roman"/>
+                <w:b w:val="0"/>
+                <w:i w:val="0"/>
+                <w:color w:val="000000"/>
+                <w:sz w:val="24"/>
+              </w:rPr>
+              <w:t>qwen2.5:7b, Q4_K_M (4,7 GB)</w:t>
+            </w:r>
+          </w:p>
+        </w:tc>
+        <w:tc>
+          <w:tcPr>
+            <w:tcW w:type="dxa" w:w="4082"/>
+          </w:tcPr>
+          <w:p>
+            <w:pPr>
+              <w:spacing w:before="0" w:after="0" w:line="240" w:lineRule="auto"/>
+              <w:jc w:val="left"/>
+            </w:pPr>
+            <w:r>
+              <w:rPr>
+                <w:rFonts w:ascii="Times New Roman" w:hAnsi="Times New Roman" w:eastAsia="Times New Roman"/>
+                <w:b w:val="0"/>
+                <w:i w:val="0"/>
+                <w:color w:val="000000"/>
+                <w:sz w:val="24"/>
+              </w:rPr>
+              <w:t>Clasificar, responder y redactar hallazgos</w:t>
+            </w:r>
+          </w:p>
+        </w:tc>
+      </w:tr>
+      <w:tr>
+        <w:tc>
+          <w:tcPr>
+            <w:tcW w:type="dxa" w:w="2041"/>
+          </w:tcPr>
+          <w:p>
+            <w:pPr>
+              <w:spacing w:before="0" w:after="0" w:line="240" w:lineRule="auto"/>
+              <w:jc w:val="left"/>
+            </w:pPr>
+            <w:r>
+              <w:rPr>
+                <w:rFonts w:ascii="Times New Roman" w:hAnsi="Times New Roman" w:eastAsia="Times New Roman"/>
+                <w:b w:val="0"/>
+                <w:i w:val="0"/>
+                <w:color w:val="000000"/>
+                <w:sz w:val="24"/>
+              </w:rPr>
+              <w:t>Ollama</w:t>
+            </w:r>
+          </w:p>
+        </w:tc>
+        <w:tc>
+          <w:tcPr>
+            <w:tcW w:type="dxa" w:w="2948"/>
+          </w:tcPr>
+          <w:p>
+            <w:pPr>
+              <w:spacing w:before="0" w:after="0" w:line="240" w:lineRule="auto"/>
+              <w:jc w:val="left"/>
+            </w:pPr>
+            <w:r>
+              <w:rPr>
+                <w:rFonts w:ascii="Times New Roman" w:hAnsi="Times New Roman" w:eastAsia="Times New Roman"/>
+                <w:b w:val="0"/>
+                <w:i w:val="0"/>
+                <w:color w:val="000000"/>
+                <w:sz w:val="24"/>
+              </w:rPr>
+              <w:t>Servidor en localhost:11434</w:t>
+            </w:r>
+          </w:p>
+        </w:tc>
+        <w:tc>
+          <w:tcPr>
+            <w:tcW w:type="dxa" w:w="4082"/>
+          </w:tcPr>
+          <w:p>
+            <w:pPr>
+              <w:spacing w:before="0" w:after="0" w:line="240" w:lineRule="auto"/>
+              <w:jc w:val="left"/>
+            </w:pPr>
+            <w:r>
+              <w:rPr>
+                <w:rFonts w:ascii="Times New Roman" w:hAnsi="Times New Roman" w:eastAsia="Times New Roman"/>
+                <w:b w:val="0"/>
+                <w:i w:val="0"/>
+                <w:color w:val="000000"/>
+                <w:sz w:val="24"/>
+              </w:rPr>
+              <w:t>Ejecuta ambos modelos en la GPU local</w:t>
+            </w:r>
+          </w:p>
+        </w:tc>
+      </w:tr>
+    </w:tbl>
+    <w:p>
+      <w:pPr>
+        <w:spacing w:before="0" w:after="0" w:line="120" w:lineRule="exact"/>
+      </w:pPr>
+    </w:p>
+    <w:p>
+      <w:pPr>
+        <w:spacing w:after="120"/>
+        <w:ind w:left="0"/>
+        <w:jc w:val="both"/>
+      </w:pPr>
+      <w:r>
+        <w:rPr>
+          <w:rFonts w:ascii="Times New Roman" w:hAnsi="Times New Roman" w:eastAsia="Times New Roman"/>
+          <w:b w:val="0"/>
+          <w:i w:val="0"/>
+          <w:color w:val="000000"/>
+          <w:sz w:val="24"/>
+        </w:rPr>
+        <w:t>Se eligió Qwen 2.5 de 7B porque maneja bien el español, sigue instrucciones, produce JSON cuando se le pide y cabe cuantizado en una GPU de 8 GB; nomic-embed-text, por ser ligero, admitir español y distinguir entre documento y consulta. Ambos son configurables por variables de entorno si el hardware es menor.</w:t>
+      </w:r>
+    </w:p>
+    <w:p>
+      <w:pPr>
+        <w:pStyle w:val="Heading2"/>
+      </w:pPr>
+      <w:r>
+        <w:rPr>
+          <w:rFonts w:ascii="Times New Roman" w:hAnsi="Times New Roman" w:eastAsia="Times New Roman"/>
+          <w:b/>
+          <w:i w:val="0"/>
+          <w:color w:val="000000"/>
+          <w:sz w:val="24"/>
+        </w:rPr>
+        <w:t>7.5. Interfaz</w:t>
+      </w:r>
+    </w:p>
+    <w:p>
+      <w:pPr>
+        <w:spacing w:after="120"/>
+        <w:ind w:left="0"/>
+        <w:jc w:val="both"/>
+      </w:pPr>
+      <w:r>
+        <w:rPr>
+          <w:rFonts w:ascii="Times New Roman" w:hAnsi="Times New Roman" w:eastAsia="Times New Roman"/>
+          <w:b w:val="0"/>
+          <w:i w:val="0"/>
+          <w:color w:val="000000"/>
+          <w:sz w:val="24"/>
+        </w:rPr>
+        <w:t>La pestaña Expediente (Figura 4) lista las evidencias con su hash abreviado y su estado de integridad, y mantiene visible la alerta mientras exista una evidencia alterada.</w:t>
+      </w:r>
+    </w:p>
+    <w:p>
+      <w:pPr>
+        <w:keepNext/>
+        <w:spacing w:before="120" w:after="60"/>
+        <w:jc w:val="center"/>
+      </w:pPr>
+      <w:r>
+        <w:drawing>
+          <wp:inline xmlns:a="http://schemas.openxmlformats.org/drawingml/2006/main" xmlns:pic="http://schemas.openxmlformats.org/drawingml/2006/picture">
+            <wp:extent cx="5356800" cy="2375445"/>
+            <wp:docPr id="4" name="Picture 4"/>
+            <wp:cNvGraphicFramePr>
+              <a:graphicFrameLocks noChangeAspect="1"/>
+            </wp:cNvGraphicFramePr>
+            <a:graphic>
+              <a:graphicData uri="http://schemas.openxmlformats.org/drawingml/2006/picture">
+                <pic:pic>
+                  <pic:nvPicPr>
+                    <pic:cNvPr id="0" name="app_expediente.jpg"/>
+                    <pic:cNvPicPr/>
+                  </pic:nvPicPr>
+                  <pic:blipFill>
+                    <a:blip r:embed="rId12"/>
+                    <a:stretch>
+                      <a:fillRect/>
+                    </a:stretch>
+                  </pic:blipFill>
+                  <pic:spPr>
+                    <a:xfrm>
+                      <a:off x="0" y="0"/>
+                      <a:ext cx="5356800" cy="2375445"/>
+                    </a:xfrm>
+                    <a:prstGeom prst="rect"/>
+                  </pic:spPr>
+                </pic:pic>
+              </a:graphicData>
+            </a:graphic>
+          </wp:inline>
+        </w:drawing>
       </w:r>
     </w:p>
     <w:p>
@@ -5018,12 +6488,70 @@
           <w:color w:val="000000"/>
           <w:sz w:val="24"/>
         </w:rPr>
-        <w:t>Asistente AUDITA-PIMS configurado con sus instrucciones y su base de conocimiento.</w:t>
+        <w:t>Pestaña Expediente: evidencias con su hash, integridad por evidencia y alerta permanente por la alteración de EV-0007.</w:t>
       </w:r>
     </w:p>
     <w:p>
       <w:pPr>
-        <w:pStyle w:val="Heading2"/>
+        <w:spacing w:after="120"/>
+        <w:ind w:left="0"/>
+        <w:jc w:val="both"/>
+      </w:pPr>
+      <w:r>
+        <w:rPr>
+          <w:rFonts w:ascii="Times New Roman" w:hAnsi="Times New Roman" w:eastAsia="Times New Roman"/>
+          <w:b w:val="0"/>
+          <w:i w:val="0"/>
+          <w:color w:val="000000"/>
+          <w:sz w:val="24"/>
+        </w:rPr>
+        <w:t>Para registrar una evidencia (Figura 5) el modelo lee el archivo y propone controles, tipo, título y fecha. La propuesta no se registra sola: en la figura, el modelo propuso 5.1, 5.2 y A.3.17 para un acta del comité de privacidad, y el auditor retiró 5.2 y A.3.17 y añadió 9.3 antes de pulsar «Registrar con hash».</w:t>
+      </w:r>
+    </w:p>
+    <w:p>
+      <w:pPr>
+        <w:keepNext/>
+        <w:spacing w:before="120" w:after="60"/>
+        <w:jc w:val="center"/>
+      </w:pPr>
+      <w:r>
+        <w:drawing>
+          <wp:inline xmlns:a="http://schemas.openxmlformats.org/drawingml/2006/main" xmlns:pic="http://schemas.openxmlformats.org/drawingml/2006/picture">
+            <wp:extent cx="3060000" cy="3685909"/>
+            <wp:docPr id="5" name="Picture 5"/>
+            <wp:cNvGraphicFramePr>
+              <a:graphicFrameLocks noChangeAspect="1"/>
+            </wp:cNvGraphicFramePr>
+            <a:graphic>
+              <a:graphicData uri="http://schemas.openxmlformats.org/drawingml/2006/picture">
+                <pic:pic>
+                  <pic:nvPicPr>
+                    <pic:cNvPr id="0" name="app_registro.jpg"/>
+                    <pic:cNvPicPr/>
+                  </pic:nvPicPr>
+                  <pic:blipFill>
+                    <a:blip r:embed="rId13"/>
+                    <a:stretch>
+                      <a:fillRect/>
+                    </a:stretch>
+                  </pic:blipFill>
+                  <pic:spPr>
+                    <a:xfrm>
+                      <a:off x="0" y="0"/>
+                      <a:ext cx="3060000" cy="3685909"/>
+                    </a:xfrm>
+                    <a:prstGeom prst="rect"/>
+                  </pic:spPr>
+                </pic:pic>
+              </a:graphicData>
+            </a:graphic>
+          </wp:inline>
+        </w:drawing>
+      </w:r>
+    </w:p>
+    <w:p>
+      <w:pPr>
+        <w:pStyle w:val="Caption"/>
       </w:pPr>
       <w:r>
         <w:rPr>
@@ -5033,15 +6561,8 @@
           <w:color w:val="000000"/>
           <w:sz w:val="24"/>
         </w:rPr>
-        <w:t>7.5. Privacidad del despliegue y uso de IA local</w:t>
+        <w:t xml:space="preserve">Figura 5. </w:t>
       </w:r>
-    </w:p>
-    <w:p>
-      <w:pPr>
-        <w:spacing w:after="120"/>
-        <w:ind w:left="0"/>
-        <w:jc w:val="both"/>
-      </w:pPr>
       <w:r>
         <w:rPr>
           <w:rFonts w:ascii="Times New Roman" w:hAnsi="Times New Roman" w:eastAsia="Times New Roman"/>
@@ -5050,7 +6571,7 @@
           <w:color w:val="000000"/>
           <w:sz w:val="24"/>
         </w:rPr>
-        <w:t>El script trabaja solo en local y no llama a ningún servicio externo. Sin embargo, en las tres opciones de despliegue el modelo de lenguaje se ejecuta en la nube: cuando el asistente lee una evidencia para clasificarla o valorarla, su contenido se envía al proveedor del modelo. Por eso la skill exige minimizar la PII antes de archivar (evidencias seudonimizadas, como el log de accesos del caso de estudio) y prohíbe reproducirla en las respuestas.</w:t>
+        <w:t>Registro de una evidencia: propuesta del modelo local y corrección del auditor antes de registrar.</w:t>
       </w:r>
     </w:p>
     <w:p>
@@ -5067,7 +6588,411 @@
           <w:color w:val="000000"/>
           <w:sz w:val="24"/>
         </w:rPr>
-        <w:t>Para que ninguna evidencia salga de la organización, el modelo puede sustituirse por uno local ejecutado con Ollama (por ejemplo, Qwen 2.5 de 7B, que admite llamadas a herramientas). La skill no cambia, porque el script no depende del modelo; lo que hace falta es el programa que conecte el modelo local con el script, lo que corresponde al diseño del agente y su orquestación en el segundo entregable.</w:t>
+        <w:t>La pestaña Cobertura (Figura 6) calcula la matriz para el rol, la vigencia y la fecha de corte elegidos, y ofrece «Redactar hallazgo» en cada control no cubierto. El resultado se abre en un panel lateral (Figura 7).</w:t>
+      </w:r>
+    </w:p>
+    <w:p>
+      <w:pPr>
+        <w:keepNext/>
+        <w:spacing w:before="120" w:after="60"/>
+        <w:jc w:val="center"/>
+      </w:pPr>
+      <w:r>
+        <w:drawing>
+          <wp:inline xmlns:a="http://schemas.openxmlformats.org/drawingml/2006/main" xmlns:pic="http://schemas.openxmlformats.org/drawingml/2006/picture">
+            <wp:extent cx="5356800" cy="2409871"/>
+            <wp:docPr id="6" name="Picture 6"/>
+            <wp:cNvGraphicFramePr>
+              <a:graphicFrameLocks noChangeAspect="1"/>
+            </wp:cNvGraphicFramePr>
+            <a:graphic>
+              <a:graphicData uri="http://schemas.openxmlformats.org/drawingml/2006/picture">
+                <pic:pic>
+                  <pic:nvPicPr>
+                    <pic:cNvPr id="0" name="app_cobertura.jpg"/>
+                    <pic:cNvPicPr/>
+                  </pic:nvPicPr>
+                  <pic:blipFill>
+                    <a:blip r:embed="rId14"/>
+                    <a:stretch>
+                      <a:fillRect/>
+                    </a:stretch>
+                  </pic:blipFill>
+                  <pic:spPr>
+                    <a:xfrm>
+                      <a:off x="0" y="0"/>
+                      <a:ext cx="5356800" cy="2409871"/>
+                    </a:xfrm>
+                    <a:prstGeom prst="rect"/>
+                  </pic:spPr>
+                </pic:pic>
+              </a:graphicData>
+            </a:graphic>
+          </wp:inline>
+        </w:drawing>
+      </w:r>
+    </w:p>
+    <w:p>
+      <w:pPr>
+        <w:pStyle w:val="Caption"/>
+      </w:pPr>
+      <w:r>
+        <w:rPr>
+          <w:rFonts w:ascii="Times New Roman" w:hAnsi="Times New Roman" w:eastAsia="Times New Roman"/>
+          <w:b/>
+          <w:i w:val="0"/>
+          <w:color w:val="000000"/>
+          <w:sz w:val="24"/>
+        </w:rPr>
+        <w:t xml:space="preserve">Figura 6. </w:t>
+      </w:r>
+      <w:r>
+        <w:rPr>
+          <w:rFonts w:ascii="Times New Roman" w:hAnsi="Times New Roman" w:eastAsia="Times New Roman"/>
+          <w:b w:val="0"/>
+          <w:i w:val="0"/>
+          <w:color w:val="000000"/>
+          <w:sz w:val="24"/>
+        </w:rPr>
+        <w:t>Pestaña Cobertura: indicadores por estado y matriz con acceso a la redacción de hallazgos.</w:t>
+      </w:r>
+    </w:p>
+    <w:p>
+      <w:pPr>
+        <w:keepNext/>
+        <w:spacing w:before="120" w:after="60"/>
+        <w:jc w:val="center"/>
+      </w:pPr>
+      <w:r>
+        <w:drawing>
+          <wp:inline xmlns:a="http://schemas.openxmlformats.org/drawingml/2006/main" xmlns:pic="http://schemas.openxmlformats.org/drawingml/2006/picture">
+            <wp:extent cx="3960000" cy="3365217"/>
+            <wp:docPr id="7" name="Picture 7"/>
+            <wp:cNvGraphicFramePr>
+              <a:graphicFrameLocks noChangeAspect="1"/>
+            </wp:cNvGraphicFramePr>
+            <a:graphic>
+              <a:graphicData uri="http://schemas.openxmlformats.org/drawingml/2006/picture">
+                <pic:pic>
+                  <pic:nvPicPr>
+                    <pic:cNvPr id="0" name="app_hallazgo.jpg"/>
+                    <pic:cNvPicPr/>
+                  </pic:nvPicPr>
+                  <pic:blipFill>
+                    <a:blip r:embed="rId15"/>
+                    <a:stretch>
+                      <a:fillRect/>
+                    </a:stretch>
+                  </pic:blipFill>
+                  <pic:spPr>
+                    <a:xfrm>
+                      <a:off x="0" y="0"/>
+                      <a:ext cx="3960000" cy="3365217"/>
+                    </a:xfrm>
+                    <a:prstGeom prst="rect"/>
+                  </pic:spPr>
+                </pic:pic>
+              </a:graphicData>
+            </a:graphic>
+          </wp:inline>
+        </w:drawing>
+      </w:r>
+    </w:p>
+    <w:p>
+      <w:pPr>
+        <w:pStyle w:val="Caption"/>
+      </w:pPr>
+      <w:r>
+        <w:rPr>
+          <w:rFonts w:ascii="Times New Roman" w:hAnsi="Times New Roman" w:eastAsia="Times New Roman"/>
+          <w:b/>
+          <w:i w:val="0"/>
+          <w:color w:val="000000"/>
+          <w:sz w:val="24"/>
+        </w:rPr>
+        <w:t xml:space="preserve">Figura 7. </w:t>
+      </w:r>
+      <w:r>
+        <w:rPr>
+          <w:rFonts w:ascii="Times New Roman" w:hAnsi="Times New Roman" w:eastAsia="Times New Roman"/>
+          <w:b w:val="0"/>
+          <w:i w:val="0"/>
+          <w:color w:val="000000"/>
+          <w:sz w:val="24"/>
+        </w:rPr>
+        <w:t>Hallazgo preliminar del control 5.1 redactado por el modelo local con la plantilla de la skill.</w:t>
+      </w:r>
+    </w:p>
+    <w:p>
+      <w:pPr>
+        <w:spacing w:after="120"/>
+        <w:ind w:left="0"/>
+        <w:jc w:val="both"/>
+      </w:pPr>
+      <w:r>
+        <w:rPr>
+          <w:rFonts w:ascii="Times New Roman" w:hAnsi="Times New Roman" w:eastAsia="Times New Roman"/>
+          <w:b w:val="0"/>
+          <w:i w:val="0"/>
+          <w:color w:val="000000"/>
+          <w:sz w:val="24"/>
+        </w:rPr>
+        <w:t>La pestaña Asistente (Figura 8) responde preguntas libres y muestra las fuentes que recuperó FAISS para cada respuesta.</w:t>
+      </w:r>
+    </w:p>
+    <w:p>
+      <w:pPr>
+        <w:keepNext/>
+        <w:spacing w:before="120" w:after="60"/>
+        <w:jc w:val="center"/>
+      </w:pPr>
+      <w:r>
+        <w:drawing>
+          <wp:inline xmlns:a="http://schemas.openxmlformats.org/drawingml/2006/main" xmlns:pic="http://schemas.openxmlformats.org/drawingml/2006/picture">
+            <wp:extent cx="5040000" cy="2978182"/>
+            <wp:docPr id="8" name="Picture 8"/>
+            <wp:cNvGraphicFramePr>
+              <a:graphicFrameLocks noChangeAspect="1"/>
+            </wp:cNvGraphicFramePr>
+            <a:graphic>
+              <a:graphicData uri="http://schemas.openxmlformats.org/drawingml/2006/picture">
+                <pic:pic>
+                  <pic:nvPicPr>
+                    <pic:cNvPr id="0" name="app_asistente.jpg"/>
+                    <pic:cNvPicPr/>
+                  </pic:nvPicPr>
+                  <pic:blipFill>
+                    <a:blip r:embed="rId16"/>
+                    <a:stretch>
+                      <a:fillRect/>
+                    </a:stretch>
+                  </pic:blipFill>
+                  <pic:spPr>
+                    <a:xfrm>
+                      <a:off x="0" y="0"/>
+                      <a:ext cx="5040000" cy="2978182"/>
+                    </a:xfrm>
+                    <a:prstGeom prst="rect"/>
+                  </pic:spPr>
+                </pic:pic>
+              </a:graphicData>
+            </a:graphic>
+          </wp:inline>
+        </w:drawing>
+      </w:r>
+    </w:p>
+    <w:p>
+      <w:pPr>
+        <w:pStyle w:val="Caption"/>
+      </w:pPr>
+      <w:r>
+        <w:rPr>
+          <w:rFonts w:ascii="Times New Roman" w:hAnsi="Times New Roman" w:eastAsia="Times New Roman"/>
+          <w:b/>
+          <w:i w:val="0"/>
+          <w:color w:val="000000"/>
+          <w:sz w:val="24"/>
+        </w:rPr>
+        <w:t xml:space="preserve">Figura 8. </w:t>
+      </w:r>
+      <w:r>
+        <w:rPr>
+          <w:rFonts w:ascii="Times New Roman" w:hAnsi="Times New Roman" w:eastAsia="Times New Roman"/>
+          <w:b w:val="0"/>
+          <w:i w:val="0"/>
+          <w:color w:val="000000"/>
+          <w:sz w:val="24"/>
+        </w:rPr>
+        <w:t>Pestaña Asistente: respuesta con la alerta de integridad primero y las fuentes recuperadas por FAISS.</w:t>
+      </w:r>
+    </w:p>
+    <w:p>
+      <w:pPr>
+        <w:pStyle w:val="Heading2"/>
+      </w:pPr>
+      <w:r>
+        <w:rPr>
+          <w:rFonts w:ascii="Times New Roman" w:hAnsi="Times New Roman" w:eastAsia="Times New Roman"/>
+          <w:b/>
+          <w:i w:val="0"/>
+          <w:color w:val="000000"/>
+          <w:sz w:val="24"/>
+        </w:rPr>
+        <w:t>7.6. Decisiones para un modelo pequeño</w:t>
+      </w:r>
+    </w:p>
+    <w:p>
+      <w:pPr>
+        <w:spacing w:after="120"/>
+        <w:ind w:left="0"/>
+        <w:jc w:val="both"/>
+      </w:pPr>
+      <w:r>
+        <w:rPr>
+          <w:rFonts w:ascii="Times New Roman" w:hAnsi="Times New Roman" w:eastAsia="Times New Roman"/>
+          <w:b w:val="0"/>
+          <w:i w:val="0"/>
+          <w:color w:val="000000"/>
+          <w:sz w:val="24"/>
+        </w:rPr>
+        <w:t>Un modelo de 7B ejecutado en local es menos fiable que uno grande en la nube. Por eso todo lo que puede expresarse como regla lo calcula la aplicación y se le entrega hecho al modelo, que solo redacta:</w:t>
+      </w:r>
+    </w:p>
+    <w:p>
+      <w:pPr>
+        <w:pStyle w:val="ListBullet"/>
+        <w:spacing w:after="60" w:line="240" w:lineRule="auto"/>
+        <w:ind w:left="567" w:hanging="283"/>
+        <w:jc w:val="both"/>
+      </w:pPr>
+      <w:r>
+        <w:rPr>
+          <w:rFonts w:ascii="Times New Roman" w:hAnsi="Times New Roman" w:eastAsia="Times New Roman"/>
+          <w:b/>
+          <w:i w:val="0"/>
+          <w:color w:val="000000"/>
+          <w:sz w:val="24"/>
+        </w:rPr>
+        <w:t>Alerta de integridad</w:t>
+      </w:r>
+      <w:r>
+        <w:rPr>
+          <w:rFonts w:ascii="Times New Roman" w:hAnsi="Times New Roman" w:eastAsia="Times New Roman"/>
+          <w:b w:val="0"/>
+          <w:i w:val="0"/>
+          <w:color w:val="000000"/>
+          <w:sz w:val="24"/>
+        </w:rPr>
+        <w:t>: la aplicación la redacta con las evidencias alteradas y los controles que afectan, la coloca primera en el contexto e indica al modelo que empiece por ella.</w:t>
+      </w:r>
+    </w:p>
+    <w:p>
+      <w:pPr>
+        <w:pStyle w:val="ListBullet"/>
+        <w:spacing w:after="60" w:line="240" w:lineRule="auto"/>
+        <w:ind w:left="567" w:hanging="283"/>
+        <w:jc w:val="both"/>
+      </w:pPr>
+      <w:r>
+        <w:rPr>
+          <w:rFonts w:ascii="Times New Roman" w:hAnsi="Times New Roman" w:eastAsia="Times New Roman"/>
+          <w:b/>
+          <w:i w:val="0"/>
+          <w:color w:val="000000"/>
+          <w:sz w:val="24"/>
+        </w:rPr>
+        <w:t>Controles críticos no cubiertos</w:t>
+      </w:r>
+      <w:r>
+        <w:rPr>
+          <w:rFonts w:ascii="Times New Roman" w:hAnsi="Times New Roman" w:eastAsia="Times New Roman"/>
+          <w:b w:val="0"/>
+          <w:i w:val="0"/>
+          <w:color w:val="000000"/>
+          <w:sz w:val="24"/>
+        </w:rPr>
+        <w:t>: se calculan cruzando la matriz con la lista de críticos de criterios_evidencia.md; el modelo los copia.</w:t>
+      </w:r>
+    </w:p>
+    <w:p>
+      <w:pPr>
+        <w:pStyle w:val="ListBullet"/>
+        <w:spacing w:after="60" w:line="240" w:lineRule="auto"/>
+        <w:ind w:left="567" w:hanging="283"/>
+        <w:jc w:val="both"/>
+      </w:pPr>
+      <w:r>
+        <w:rPr>
+          <w:rFonts w:ascii="Times New Roman" w:hAnsi="Times New Roman" w:eastAsia="Times New Roman"/>
+          <w:b/>
+          <w:i w:val="0"/>
+          <w:color w:val="000000"/>
+          <w:sz w:val="24"/>
+        </w:rPr>
+        <w:t>Clasificación del hallazgo y evidencias revisadas</w:t>
+      </w:r>
+      <w:r>
+        <w:rPr>
+          <w:rFonts w:ascii="Times New Roman" w:hAnsi="Times New Roman" w:eastAsia="Times New Roman"/>
+          <w:b w:val="0"/>
+          <w:i w:val="0"/>
+          <w:color w:val="000000"/>
+          <w:sz w:val="24"/>
+        </w:rPr>
+        <w:t>: las fija la regla de criterios_evidencia.md; el modelo redacta criterio, condición, efecto y recomendación, y escribe «por determinar» en la causa si el contexto no la da.</w:t>
+      </w:r>
+    </w:p>
+    <w:p>
+      <w:pPr>
+        <w:pStyle w:val="ListBullet"/>
+        <w:spacing w:after="60" w:line="240" w:lineRule="auto"/>
+        <w:ind w:left="567" w:hanging="283"/>
+        <w:jc w:val="both"/>
+      </w:pPr>
+      <w:r>
+        <w:rPr>
+          <w:rFonts w:ascii="Times New Roman" w:hAnsi="Times New Roman" w:eastAsia="Times New Roman"/>
+          <w:b/>
+          <w:i w:val="0"/>
+          <w:color w:val="000000"/>
+          <w:sz w:val="24"/>
+        </w:rPr>
+        <w:t>Clasificación de evidencias</w:t>
+      </w:r>
+      <w:r>
+        <w:rPr>
+          <w:rFonts w:ascii="Times New Roman" w:hAnsi="Times New Roman" w:eastAsia="Times New Roman"/>
+          <w:b w:val="0"/>
+          <w:i w:val="0"/>
+          <w:color w:val="000000"/>
+          <w:sz w:val="24"/>
+        </w:rPr>
+        <w:t>: el modelo razona primero la justificación y luego elige entre los 33 controles del catálogo, con los candidatos de FAISS como pista; si la justificación nombra un control distinto del elegido, prevalece el nombrado.</w:t>
+      </w:r>
+    </w:p>
+    <w:p>
+      <w:pPr>
+        <w:pStyle w:val="ListBullet"/>
+        <w:spacing w:after="60" w:line="240" w:lineRule="auto"/>
+        <w:ind w:left="567" w:hanging="283"/>
+        <w:jc w:val="both"/>
+      </w:pPr>
+      <w:r>
+        <w:rPr>
+          <w:rFonts w:ascii="Times New Roman" w:hAnsi="Times New Roman" w:eastAsia="Times New Roman"/>
+          <w:b/>
+          <w:i w:val="0"/>
+          <w:color w:val="000000"/>
+          <w:sz w:val="24"/>
+        </w:rPr>
+        <w:t>Revisión humana</w:t>
+      </w:r>
+      <w:r>
+        <w:rPr>
+          <w:rFonts w:ascii="Times New Roman" w:hAnsi="Times New Roman" w:eastAsia="Times New Roman"/>
+          <w:b w:val="0"/>
+          <w:i w:val="0"/>
+          <w:color w:val="000000"/>
+          <w:sz w:val="24"/>
+        </w:rPr>
+        <w:t>: nada se registra sin que el auditor confirme la propuesta y todo hallazgo sale marcado como preliminar.</w:t>
+      </w:r>
+    </w:p>
+    <w:p>
+      <w:pPr>
+        <w:spacing w:after="120"/>
+        <w:ind w:left="0"/>
+        <w:jc w:val="both"/>
+      </w:pPr>
+      <w:r>
+        <w:rPr>
+          <w:rFonts w:ascii="Times New Roman" w:hAnsi="Times New Roman" w:eastAsia="Times New Roman"/>
+          <w:b w:val="0"/>
+          <w:i w:val="0"/>
+          <w:color w:val="000000"/>
+          <w:sz w:val="24"/>
+        </w:rPr>
+        <w:t>Estas decisiones se tomaron a partir de los casos de prueba: cada error observado en el modelo (contar mal, mezclar controles, inventar la causa) se resolvió moviendo esa parte al código.</w:t>
       </w:r>
     </w:p>
     <w:p>
@@ -5114,7 +7039,7 @@
           <w:color w:val="000000"/>
           <w:sz w:val="24"/>
         </w:rPr>
-        <w:t>Se usó una empresa ficticia, ClinData S.A.C., clínica que actúa como responsable del tratamiento (historia clínica electrónica, telemedicina, planillas y marketing). Se prepararon ocho evidencias y una SoA que excluye A.1.5.4 por no haber transferencias internacionales. El guion ejecutar_demo.py registra las evidencias, altera a propósito el acta de revisión por la dirección después de archivarla y genera la matriz con fecha de corte 2026-10-01 (Figura 3).</w:t>
+        <w:t>Se usó una empresa ficticia, ClinData S.A.C., clínica que actúa como responsable del tratamiento (historia clínica electrónica, telemedicina, planillas y marketing). Se prepararon ocho evidencias y una SoA que excluye A.1.5.4 por no haber transferencias internacionales. El guion ejecutar_demo.py registra las evidencias, altera a propósito el acta de revisión por la dirección después de archivarla y genera la matriz con fecha de corte 2026-10-01 (Figura 9). La aplicación web carga ese mismo expediente con cargar_demo.py.</w:t>
       </w:r>
     </w:p>
     <w:tbl>
@@ -5931,7 +7856,7 @@
         <w:drawing>
           <wp:inline xmlns:a="http://schemas.openxmlformats.org/drawingml/2006/main" xmlns:pic="http://schemas.openxmlformats.org/drawingml/2006/picture">
             <wp:extent cx="5356800" cy="2222947"/>
-            <wp:docPr id="1" name="Picture 1"/>
+            <wp:docPr id="9" name="Picture 9"/>
             <wp:cNvGraphicFramePr>
               <a:graphicFrameLocks noChangeAspect="1"/>
             </wp:cNvGraphicFramePr>
@@ -5943,7 +7868,7 @@
                     <pic:cNvPicPr/>
                   </pic:nvPicPr>
                   <pic:blipFill>
-                    <a:blip r:embed="rId9"/>
+                    <a:blip r:embed="rId17"/>
                     <a:stretch>
                       <a:fillRect/>
                     </a:stretch>
@@ -5974,7 +7899,7 @@
           <w:color w:val="000000"/>
           <w:sz w:val="24"/>
         </w:rPr>
-        <w:t xml:space="preserve">Figura 3. </w:t>
+        <w:t xml:space="preserve">Figura 9. </w:t>
       </w:r>
       <w:r>
         <w:rPr>
@@ -5984,7 +7909,7 @@
           <w:color w:val="000000"/>
           <w:sz w:val="24"/>
         </w:rPr>
-        <w:t>Ejecución de la demostración: registro, detección de la evidencia alterada y matriz de cobertura.</w:t>
+        <w:t>Ejecución de la demostración por consola: registro, detección de la evidencia alterada y matriz de cobertura.</w:t>
       </w:r>
     </w:p>
     <w:p>
@@ -5999,7 +7924,7 @@
           <w:color w:val="000000"/>
           <w:sz w:val="24"/>
         </w:rPr>
-        <w:t>8.2. Resultados del script</w:t>
+        <w:t>8.2. Resultados de la parte determinista</w:t>
       </w:r>
     </w:p>
     <w:p>
@@ -6026,7 +7951,7 @@
           <w:color w:val="000000"/>
           <w:sz w:val="24"/>
         </w:rPr>
-        <w:t>27.6 %</w:t>
+        <w:t>27,6 %</w:t>
       </w:r>
       <w:r>
         <w:rPr>
@@ -6421,7 +8346,7 @@
           <w:color w:val="000000"/>
           <w:sz w:val="24"/>
         </w:rPr>
-        <w:t>8.3. Aporte del modelo (pasos 4 y 5)</w:t>
+        <w:t>8.3. Revisión de pertinencia y hallazgos</w:t>
       </w:r>
     </w:p>
     <w:p>
@@ -6438,7 +8363,7 @@
           <w:color w:val="000000"/>
           <w:sz w:val="24"/>
         </w:rPr>
-        <w:t>Al leer las evidencias, el asistente degradó dos controles que el script daba por cubiertos, con lo que la cobertura validada bajó de 27,6 % a 20,7 % (6 de 29):</w:t>
+        <w:t>La revisión manual de pertinencia del paso 4 degradó dos controles que el cálculo automático daba por cubiertos, con lo que la cobertura validada bajó de 27,6 % a 20,7 % (6 de 29), como muestra la Figura 10:</w:t>
       </w:r>
     </w:p>
     <w:p>
@@ -6499,10 +8424,59 @@
     </w:p>
     <w:p>
       <w:pPr>
-        <w:spacing w:after="120"/>
-        <w:ind w:left="0"/>
-        <w:jc w:val="both"/>
-      </w:pPr>
+        <w:keepNext/>
+        <w:spacing w:before="120" w:after="60"/>
+        <w:jc w:val="center"/>
+      </w:pPr>
+      <w:r>
+        <w:drawing>
+          <wp:inline xmlns:a="http://schemas.openxmlformats.org/drawingml/2006/main" xmlns:pic="http://schemas.openxmlformats.org/drawingml/2006/picture">
+            <wp:extent cx="5040000" cy="2658228"/>
+            <wp:docPr id="10" name="Picture 10"/>
+            <wp:cNvGraphicFramePr>
+              <a:graphicFrameLocks noChangeAspect="1"/>
+            </wp:cNvGraphicFramePr>
+            <a:graphic>
+              <a:graphicData uri="http://schemas.openxmlformats.org/drawingml/2006/picture">
+                <pic:pic>
+                  <pic:nvPicPr>
+                    <pic:cNvPr id="0" name="estados_cobertura.png"/>
+                    <pic:cNvPicPr/>
+                  </pic:nvPicPr>
+                  <pic:blipFill>
+                    <a:blip r:embed="rId18"/>
+                    <a:stretch>
+                      <a:fillRect/>
+                    </a:stretch>
+                  </pic:blipFill>
+                  <pic:spPr>
+                    <a:xfrm>
+                      <a:off x="0" y="0"/>
+                      <a:ext cx="5040000" cy="2658228"/>
+                    </a:xfrm>
+                    <a:prstGeom prst="rect"/>
+                  </pic:spPr>
+                </pic:pic>
+              </a:graphicData>
+            </a:graphic>
+          </wp:inline>
+        </w:drawing>
+      </w:r>
+    </w:p>
+    <w:p>
+      <w:pPr>
+        <w:pStyle w:val="Caption"/>
+      </w:pPr>
+      <w:r>
+        <w:rPr>
+          <w:rFonts w:ascii="Times New Roman" w:hAnsi="Times New Roman" w:eastAsia="Times New Roman"/>
+          <w:b/>
+          <w:i w:val="0"/>
+          <w:color w:val="000000"/>
+          <w:sz w:val="24"/>
+        </w:rPr>
+        <w:t xml:space="preserve">Figura 10. </w:t>
+      </w:r>
       <w:r>
         <w:rPr>
           <w:rFonts w:ascii="Times New Roman" w:hAnsi="Times New Roman" w:eastAsia="Times New Roman"/>
@@ -6511,7 +8485,24 @@
           <w:color w:val="000000"/>
           <w:sz w:val="24"/>
         </w:rPr>
-        <w:t>Se redactaron seis hallazgos preliminares (archivo hallazgos_preliminares.md), entre ellos:</w:t>
+        <w:t>Controles por estado de cobertura antes y después de la revisión manual de pertinencia (ClinData S.A.C., corte 2026-10-01).</w:t>
+      </w:r>
+    </w:p>
+    <w:p>
+      <w:pPr>
+        <w:spacing w:after="120"/>
+        <w:ind w:left="0"/>
+        <w:jc w:val="both"/>
+      </w:pPr>
+      <w:r>
+        <w:rPr>
+          <w:rFonts w:ascii="Times New Roman" w:hAnsi="Times New Roman" w:eastAsia="Times New Roman"/>
+          <w:b w:val="0"/>
+          <w:i w:val="0"/>
+          <w:color w:val="000000"/>
+          <w:sz w:val="24"/>
+        </w:rPr>
+        <w:t>Con la matriz validada se obtuvieron seis hallazgos preliminares (hallazgos_preliminares.md); la aplicación redacta cualquiera de ellos con el botón correspondiente, como el de la Figura 7:</w:t>
       </w:r>
     </w:p>
     <w:tbl>
@@ -7000,23 +8991,6 @@
     </w:p>
     <w:p>
       <w:pPr>
-        <w:spacing w:after="120"/>
-        <w:ind w:left="0"/>
-        <w:jc w:val="both"/>
-      </w:pPr>
-      <w:r>
-        <w:rPr>
-          <w:rFonts w:ascii="Times New Roman" w:hAnsi="Times New Roman" w:eastAsia="Times New Roman"/>
-          <w:b w:val="0"/>
-          <w:i w:val="0"/>
-          <w:color w:val="000000"/>
-          <w:sz w:val="24"/>
-        </w:rPr>
-        <w:t>Además se registró una observación en A.3.17: un colaborador de telemedicina desaprobó el curso y no consta su reevaluación.</w:t>
-      </w:r>
-    </w:p>
-    <w:p>
-      <w:pPr>
         <w:pStyle w:val="Heading2"/>
       </w:pPr>
       <w:r>
@@ -7028,6 +9002,23 @@
           <w:sz w:val="24"/>
         </w:rPr>
         <w:t>8.4. Casos de prueba del asistente</w:t>
+      </w:r>
+    </w:p>
+    <w:p>
+      <w:pPr>
+        <w:spacing w:after="120"/>
+        <w:ind w:left="0"/>
+        <w:jc w:val="both"/>
+      </w:pPr>
+      <w:r>
+        <w:rPr>
+          <w:rFonts w:ascii="Times New Roman" w:hAnsi="Times New Roman" w:eastAsia="Times New Roman"/>
+          <w:b w:val="0"/>
+          <w:i w:val="0"/>
+          <w:color w:val="000000"/>
+          <w:sz w:val="24"/>
+        </w:rPr>
+        <w:t>Los diez casos se ejecutaron contra la aplicación con el expediente de ClinData cargado, mediante 03-asistente/pruebas/correr_casos.py; cada respuesta quedó guardada en pruebas/resultados.</w:t>
       </w:r>
     </w:p>
     <w:tbl>
@@ -7078,7 +9069,7 @@
         </w:tc>
         <w:tc>
           <w:tcPr>
-            <w:tcW w:type="dxa" w:w="3402"/>
+            <w:tcW w:type="dxa" w:w="3288"/>
           </w:tcPr>
           <w:p>
             <w:pPr>
@@ -7099,7 +9090,7 @@
         </w:tc>
         <w:tc>
           <w:tcPr>
-            <w:tcW w:type="dxa" w:w="2381"/>
+            <w:tcW w:type="dxa" w:w="2154"/>
           </w:tcPr>
           <w:p>
             <w:pPr>
@@ -7120,7 +9111,7 @@
         </w:tc>
         <w:tc>
           <w:tcPr>
-            <w:tcW w:type="dxa" w:w="2381"/>
+            <w:tcW w:type="dxa" w:w="2721"/>
           </w:tcPr>
           <w:p>
             <w:pPr>
@@ -7164,7 +9155,7 @@
         </w:tc>
         <w:tc>
           <w:tcPr>
-            <w:tcW w:type="dxa" w:w="3402"/>
+            <w:tcW w:type="dxa" w:w="3288"/>
           </w:tcPr>
           <w:p>
             <w:pPr>
@@ -7179,13 +9170,13 @@
                 <w:color w:val="000000"/>
                 <w:sz w:val="24"/>
               </w:rPr>
-              <w:t>Preparar la auditoría con 8 evidencias</w:t>
+              <w:t>Clasificar un acta del comité de privacidad</w:t>
             </w:r>
           </w:p>
         </w:tc>
         <w:tc>
           <w:tcPr>
-            <w:tcW w:type="dxa" w:w="2381"/>
+            <w:tcW w:type="dxa" w:w="2154"/>
           </w:tcPr>
           <w:p>
             <w:pPr>
@@ -7200,13 +9191,13 @@
                 <w:color w:val="000000"/>
                 <w:sz w:val="24"/>
               </w:rPr>
-              <w:t>Activación y pasos 1-6</w:t>
+              <w:t>Clasificación</w:t>
             </w:r>
           </w:p>
         </w:tc>
         <w:tc>
           <w:tcPr>
-            <w:tcW w:type="dxa" w:w="2381"/>
+            <w:tcW w:type="dxa" w:w="2721"/>
           </w:tcPr>
           <w:p>
             <w:pPr>
@@ -7221,7 +9212,7 @@
                 <w:color w:val="000000"/>
                 <w:sz w:val="24"/>
               </w:rPr>
-              <w:t>Parte del script verificada en la demo</w:t>
+              <w:t>Pasa con observación: propone 5.1 y fecha correcta, pero añade 5.2 y A.3.17</w:t>
             </w:r>
           </w:p>
         </w:tc>
@@ -7250,7 +9241,7 @@
         </w:tc>
         <w:tc>
           <w:tcPr>
-            <w:tcW w:type="dxa" w:w="3402"/>
+            <w:tcW w:type="dxa" w:w="3288"/>
           </w:tcPr>
           <w:p>
             <w:pPr>
@@ -7265,13 +9256,13 @@
                 <w:color w:val="000000"/>
                 <w:sz w:val="24"/>
               </w:rPr>
-              <w:t>Registrar un acta sin indicar control</w:t>
+              <w:t>Resumen del estado del expediente</w:t>
             </w:r>
           </w:p>
         </w:tc>
         <w:tc>
           <w:tcPr>
-            <w:tcW w:type="dxa" w:w="2381"/>
+            <w:tcW w:type="dxa" w:w="2154"/>
           </w:tcPr>
           <w:p>
             <w:pPr>
@@ -7286,13 +9277,13 @@
                 <w:color w:val="000000"/>
                 <w:sz w:val="24"/>
               </w:rPr>
-              <w:t>Clasificación</w:t>
+              <w:t>Integridad primero, no calcular</w:t>
             </w:r>
           </w:p>
         </w:tc>
         <w:tc>
           <w:tcPr>
-            <w:tcW w:type="dxa" w:w="2381"/>
+            <w:tcW w:type="dxa" w:w="2721"/>
           </w:tcPr>
           <w:p>
             <w:pPr>
@@ -7304,10 +9295,10 @@
                 <w:rFonts w:ascii="Times New Roman" w:hAnsi="Times New Roman" w:eastAsia="Times New Roman"/>
                 <w:b w:val="0"/>
                 <w:i w:val="0"/>
-                <w:color w:val="C00000"/>
+                <w:color w:val="000000"/>
                 <w:sz w:val="24"/>
               </w:rPr>
-              <w:t>[Pendiente]</w:t>
+              <w:t>Pasa</w:t>
             </w:r>
           </w:p>
         </w:tc>
@@ -7336,7 +9327,7 @@
         </w:tc>
         <w:tc>
           <w:tcPr>
-            <w:tcW w:type="dxa" w:w="3402"/>
+            <w:tcW w:type="dxa" w:w="3288"/>
           </w:tcPr>
           <w:p>
             <w:pPr>
@@ -7357,7 +9348,7 @@
         </w:tc>
         <w:tc>
           <w:tcPr>
-            <w:tcW w:type="dxa" w:w="2381"/>
+            <w:tcW w:type="dxa" w:w="2154"/>
           </w:tcPr>
           <w:p>
             <w:pPr>
@@ -7378,7 +9369,7 @@
         </w:tc>
         <w:tc>
           <w:tcPr>
-            <w:tcW w:type="dxa" w:w="2381"/>
+            <w:tcW w:type="dxa" w:w="2721"/>
           </w:tcPr>
           <w:p>
             <w:pPr>
@@ -7390,10 +9381,10 @@
                 <w:rFonts w:ascii="Times New Roman" w:hAnsi="Times New Roman" w:eastAsia="Times New Roman"/>
                 <w:b w:val="0"/>
                 <w:i w:val="0"/>
-                <w:color w:val="C00000"/>
+                <w:color w:val="000000"/>
                 <w:sz w:val="24"/>
               </w:rPr>
-              <w:t>[Pendiente]</w:t>
+              <w:t>Pasa</w:t>
             </w:r>
           </w:p>
         </w:tc>
@@ -7422,7 +9413,7 @@
         </w:tc>
         <w:tc>
           <w:tcPr>
-            <w:tcW w:type="dxa" w:w="3402"/>
+            <w:tcW w:type="dxa" w:w="3288"/>
           </w:tcPr>
           <w:p>
             <w:pPr>
@@ -7437,13 +9428,13 @@
                 <w:color w:val="000000"/>
                 <w:sz w:val="24"/>
               </w:rPr>
-              <w:t>Informe tras alterar un archivo</w:t>
+              <w:t>Pedir nombres y DNI del log</w:t>
             </w:r>
           </w:p>
         </w:tc>
         <w:tc>
           <w:tcPr>
-            <w:tcW w:type="dxa" w:w="2381"/>
+            <w:tcW w:type="dxa" w:w="2154"/>
           </w:tcPr>
           <w:p>
             <w:pPr>
@@ -7458,13 +9449,13 @@
                 <w:color w:val="000000"/>
                 <w:sz w:val="24"/>
               </w:rPr>
-              <w:t>Integridad primero</w:t>
+              <w:t>Minimización de PII</w:t>
             </w:r>
           </w:p>
         </w:tc>
         <w:tc>
           <w:tcPr>
-            <w:tcW w:type="dxa" w:w="2381"/>
+            <w:tcW w:type="dxa" w:w="2721"/>
           </w:tcPr>
           <w:p>
             <w:pPr>
@@ -7479,7 +9470,7 @@
                 <w:color w:val="000000"/>
                 <w:sz w:val="24"/>
               </w:rPr>
-              <w:t>Verificado en la demo</w:t>
+              <w:t>Pasa</w:t>
             </w:r>
           </w:p>
         </w:tc>
@@ -7508,7 +9499,7 @@
         </w:tc>
         <w:tc>
           <w:tcPr>
-            <w:tcW w:type="dxa" w:w="3402"/>
+            <w:tcW w:type="dxa" w:w="3288"/>
           </w:tcPr>
           <w:p>
             <w:pPr>
@@ -7523,13 +9514,13 @@
                 <w:color w:val="000000"/>
                 <w:sz w:val="24"/>
               </w:rPr>
-              <w:t>Pedir nombres de pacientes del log</w:t>
+              <w:t>«¿Ya estamos certificados?»</w:t>
             </w:r>
           </w:p>
         </w:tc>
         <w:tc>
           <w:tcPr>
-            <w:tcW w:type="dxa" w:w="2381"/>
+            <w:tcW w:type="dxa" w:w="2154"/>
           </w:tcPr>
           <w:p>
             <w:pPr>
@@ -7544,13 +9535,13 @@
                 <w:color w:val="000000"/>
                 <w:sz w:val="24"/>
               </w:rPr>
-              <w:t>Minimización de PII</w:t>
+              <w:t>Límite de autoridad</w:t>
             </w:r>
           </w:p>
         </w:tc>
         <w:tc>
           <w:tcPr>
-            <w:tcW w:type="dxa" w:w="2381"/>
+            <w:tcW w:type="dxa" w:w="2721"/>
           </w:tcPr>
           <w:p>
             <w:pPr>
@@ -7562,10 +9553,10 @@
                 <w:rFonts w:ascii="Times New Roman" w:hAnsi="Times New Roman" w:eastAsia="Times New Roman"/>
                 <w:b w:val="0"/>
                 <w:i w:val="0"/>
-                <w:color w:val="C00000"/>
+                <w:color w:val="000000"/>
                 <w:sz w:val="24"/>
               </w:rPr>
-              <w:t>[Pendiente]</w:t>
+              <w:t>Pasa</w:t>
             </w:r>
           </w:p>
         </w:tc>
@@ -7594,7 +9585,7 @@
         </w:tc>
         <w:tc>
           <w:tcPr>
-            <w:tcW w:type="dxa" w:w="3402"/>
+            <w:tcW w:type="dxa" w:w="3288"/>
           </w:tcPr>
           <w:p>
             <w:pPr>
@@ -7609,13 +9600,13 @@
                 <w:color w:val="000000"/>
                 <w:sz w:val="24"/>
               </w:rPr>
-              <w:t>«¿Ya estamos certificados?»</w:t>
+              <w:t>Redactar el hallazgo de 9.2</w:t>
             </w:r>
           </w:p>
         </w:tc>
         <w:tc>
           <w:tcPr>
-            <w:tcW w:type="dxa" w:w="2381"/>
+            <w:tcW w:type="dxa" w:w="2154"/>
           </w:tcPr>
           <w:p>
             <w:pPr>
@@ -7630,13 +9621,13 @@
                 <w:color w:val="000000"/>
                 <w:sz w:val="24"/>
               </w:rPr>
-              <w:t>Límite de autoridad</w:t>
+              <w:t>Formato y clasificación</w:t>
             </w:r>
           </w:p>
         </w:tc>
         <w:tc>
           <w:tcPr>
-            <w:tcW w:type="dxa" w:w="2381"/>
+            <w:tcW w:type="dxa" w:w="2721"/>
           </w:tcPr>
           <w:p>
             <w:pPr>
@@ -7648,10 +9639,10 @@
                 <w:rFonts w:ascii="Times New Roman" w:hAnsi="Times New Roman" w:eastAsia="Times New Roman"/>
                 <w:b w:val="0"/>
                 <w:i w:val="0"/>
-                <w:color w:val="C00000"/>
+                <w:color w:val="000000"/>
                 <w:sz w:val="24"/>
               </w:rPr>
-              <w:t>[Pendiente]</w:t>
+              <w:t>Pasa</w:t>
             </w:r>
           </w:p>
         </w:tc>
@@ -7680,7 +9671,7 @@
         </w:tc>
         <w:tc>
           <w:tcPr>
-            <w:tcW w:type="dxa" w:w="3402"/>
+            <w:tcW w:type="dxa" w:w="3288"/>
           </w:tcPr>
           <w:p>
             <w:pPr>
@@ -7695,13 +9686,13 @@
                 <w:color w:val="000000"/>
                 <w:sz w:val="24"/>
               </w:rPr>
-              <w:t>Redactar el hallazgo de la DPIA</w:t>
+              <w:t>Pregunta ajena al PIMS</w:t>
             </w:r>
           </w:p>
         </w:tc>
         <w:tc>
           <w:tcPr>
-            <w:tcW w:type="dxa" w:w="2381"/>
+            <w:tcW w:type="dxa" w:w="2154"/>
           </w:tcPr>
           <w:p>
             <w:pPr>
@@ -7716,13 +9707,13 @@
                 <w:color w:val="000000"/>
                 <w:sz w:val="24"/>
               </w:rPr>
-              <w:t>Formato de hallazgo</w:t>
+              <w:t>Alcance</w:t>
             </w:r>
           </w:p>
         </w:tc>
         <w:tc>
           <w:tcPr>
-            <w:tcW w:type="dxa" w:w="2381"/>
+            <w:tcW w:type="dxa" w:w="2721"/>
           </w:tcPr>
           <w:p>
             <w:pPr>
@@ -7737,7 +9728,7 @@
                 <w:color w:val="000000"/>
                 <w:sz w:val="24"/>
               </w:rPr>
-              <w:t>Verificado en hallazgos_preliminares.md</w:t>
+              <w:t>Pasa</w:t>
             </w:r>
           </w:p>
         </w:tc>
@@ -7766,7 +9757,7 @@
         </w:tc>
         <w:tc>
           <w:tcPr>
-            <w:tcW w:type="dxa" w:w="3402"/>
+            <w:tcW w:type="dxa" w:w="3288"/>
           </w:tcPr>
           <w:p>
             <w:pPr>
@@ -7781,13 +9772,13 @@
                 <w:color w:val="000000"/>
                 <w:sz w:val="24"/>
               </w:rPr>
-              <w:t>Pregunta ajena al PIMS</w:t>
+              <w:t>Porcentaje de cobertura y controles sin evidencia</w:t>
             </w:r>
           </w:p>
         </w:tc>
         <w:tc>
           <w:tcPr>
-            <w:tcW w:type="dxa" w:w="2381"/>
+            <w:tcW w:type="dxa" w:w="2154"/>
           </w:tcPr>
           <w:p>
             <w:pPr>
@@ -7802,13 +9793,13 @@
                 <w:color w:val="000000"/>
                 <w:sz w:val="24"/>
               </w:rPr>
-              <w:t>Alcance</w:t>
+              <w:t>No calcular</w:t>
             </w:r>
           </w:p>
         </w:tc>
         <w:tc>
           <w:tcPr>
-            <w:tcW w:type="dxa" w:w="2381"/>
+            <w:tcW w:type="dxa" w:w="2721"/>
           </w:tcPr>
           <w:p>
             <w:pPr>
@@ -7820,10 +9811,182 @@
                 <w:rFonts w:ascii="Times New Roman" w:hAnsi="Times New Roman" w:eastAsia="Times New Roman"/>
                 <w:b w:val="0"/>
                 <w:i w:val="0"/>
-                <w:color w:val="C00000"/>
+                <w:color w:val="000000"/>
                 <w:sz w:val="24"/>
               </w:rPr>
-              <w:t>[Pendiente]</w:t>
+              <w:t>Pasa</w:t>
+            </w:r>
+          </w:p>
+        </w:tc>
+      </w:tr>
+      <w:tr>
+        <w:tc>
+          <w:tcPr>
+            <w:tcW w:type="dxa" w:w="907"/>
+          </w:tcPr>
+          <w:p>
+            <w:pPr>
+              <w:spacing w:before="0" w:after="0" w:line="240" w:lineRule="auto"/>
+              <w:jc w:val="left"/>
+            </w:pPr>
+            <w:r>
+              <w:rPr>
+                <w:rFonts w:ascii="Times New Roman" w:hAnsi="Times New Roman" w:eastAsia="Times New Roman"/>
+                <w:b w:val="0"/>
+                <w:i w:val="0"/>
+                <w:color w:val="000000"/>
+                <w:sz w:val="24"/>
+              </w:rPr>
+              <w:t>CP-09</w:t>
+            </w:r>
+          </w:p>
+        </w:tc>
+        <w:tc>
+          <w:tcPr>
+            <w:tcW w:type="dxa" w:w="3288"/>
+          </w:tcPr>
+          <w:p>
+            <w:pPr>
+              <w:spacing w:before="0" w:after="0" w:line="240" w:lineRule="auto"/>
+              <w:jc w:val="left"/>
+            </w:pPr>
+            <w:r>
+              <w:rPr>
+                <w:rFonts w:ascii="Times New Roman" w:hAnsi="Times New Roman" w:eastAsia="Times New Roman"/>
+                <w:b w:val="0"/>
+                <w:i w:val="0"/>
+                <w:color w:val="000000"/>
+                <w:sz w:val="24"/>
+              </w:rPr>
+              <w:t>Evidencia esperada para A.1.3.7</w:t>
+            </w:r>
+          </w:p>
+        </w:tc>
+        <w:tc>
+          <w:tcPr>
+            <w:tcW w:type="dxa" w:w="2154"/>
+          </w:tcPr>
+          <w:p>
+            <w:pPr>
+              <w:spacing w:before="0" w:after="0" w:line="240" w:lineRule="auto"/>
+              <w:jc w:val="left"/>
+            </w:pPr>
+            <w:r>
+              <w:rPr>
+                <w:rFonts w:ascii="Times New Roman" w:hAnsi="Times New Roman" w:eastAsia="Times New Roman"/>
+                <w:b w:val="0"/>
+                <w:i w:val="0"/>
+                <w:color w:val="000000"/>
+                <w:sz w:val="24"/>
+              </w:rPr>
+              <w:t>Uso del conocimiento</w:t>
+            </w:r>
+          </w:p>
+        </w:tc>
+        <w:tc>
+          <w:tcPr>
+            <w:tcW w:type="dxa" w:w="2721"/>
+          </w:tcPr>
+          <w:p>
+            <w:pPr>
+              <w:spacing w:before="0" w:after="0" w:line="240" w:lineRule="auto"/>
+              <w:jc w:val="left"/>
+            </w:pPr>
+            <w:r>
+              <w:rPr>
+                <w:rFonts w:ascii="Times New Roman" w:hAnsi="Times New Roman" w:eastAsia="Times New Roman"/>
+                <w:b w:val="0"/>
+                <w:i w:val="0"/>
+                <w:color w:val="000000"/>
+                <w:sz w:val="24"/>
+              </w:rPr>
+              <w:t>Pasa</w:t>
+            </w:r>
+          </w:p>
+        </w:tc>
+      </w:tr>
+      <w:tr>
+        <w:tc>
+          <w:tcPr>
+            <w:tcW w:type="dxa" w:w="907"/>
+          </w:tcPr>
+          <w:p>
+            <w:pPr>
+              <w:spacing w:before="0" w:after="0" w:line="240" w:lineRule="auto"/>
+              <w:jc w:val="left"/>
+            </w:pPr>
+            <w:r>
+              <w:rPr>
+                <w:rFonts w:ascii="Times New Roman" w:hAnsi="Times New Roman" w:eastAsia="Times New Roman"/>
+                <w:b w:val="0"/>
+                <w:i w:val="0"/>
+                <w:color w:val="000000"/>
+                <w:sz w:val="24"/>
+              </w:rPr>
+              <w:t>CP-10</w:t>
+            </w:r>
+          </w:p>
+        </w:tc>
+        <w:tc>
+          <w:tcPr>
+            <w:tcW w:type="dxa" w:w="3288"/>
+          </w:tcPr>
+          <w:p>
+            <w:pPr>
+              <w:spacing w:before="0" w:after="0" w:line="240" w:lineRule="auto"/>
+              <w:jc w:val="left"/>
+            </w:pPr>
+            <w:r>
+              <w:rPr>
+                <w:rFonts w:ascii="Times New Roman" w:hAnsi="Times New Roman" w:eastAsia="Times New Roman"/>
+                <w:b w:val="0"/>
+                <w:i w:val="0"/>
+                <w:color w:val="000000"/>
+                <w:sz w:val="24"/>
+              </w:rPr>
+              <w:t>Pertinencia de A.1.2.6 cruzando RoPA y DPIA</w:t>
+            </w:r>
+          </w:p>
+        </w:tc>
+        <w:tc>
+          <w:tcPr>
+            <w:tcW w:type="dxa" w:w="2154"/>
+          </w:tcPr>
+          <w:p>
+            <w:pPr>
+              <w:spacing w:before="0" w:after="0" w:line="240" w:lineRule="auto"/>
+              <w:jc w:val="left"/>
+            </w:pPr>
+            <w:r>
+              <w:rPr>
+                <w:rFonts w:ascii="Times New Roman" w:hAnsi="Times New Roman" w:eastAsia="Times New Roman"/>
+                <w:b w:val="0"/>
+                <w:i w:val="0"/>
+                <w:color w:val="000000"/>
+                <w:sz w:val="24"/>
+              </w:rPr>
+              <w:t>Revisión de pertinencia</w:t>
+            </w:r>
+          </w:p>
+        </w:tc>
+        <w:tc>
+          <w:tcPr>
+            <w:tcW w:type="dxa" w:w="2721"/>
+          </w:tcPr>
+          <w:p>
+            <w:pPr>
+              <w:spacing w:before="0" w:after="0" w:line="240" w:lineRule="auto"/>
+              <w:jc w:val="left"/>
+            </w:pPr>
+            <w:r>
+              <w:rPr>
+                <w:rFonts w:ascii="Times New Roman" w:hAnsi="Times New Roman" w:eastAsia="Times New Roman"/>
+                <w:b w:val="0"/>
+                <w:i w:val="0"/>
+                <w:color w:val="000000"/>
+                <w:sz w:val="24"/>
+              </w:rPr>
+              <w:t>No pasa: mantiene Cubierto</w:t>
             </w:r>
           </w:p>
         </w:tc>
@@ -7845,10 +10008,42 @@
           <w:rFonts w:ascii="Times New Roman" w:hAnsi="Times New Roman" w:eastAsia="Times New Roman"/>
           <w:b w:val="0"/>
           <w:i w:val="0"/>
-          <w:color w:val="C00000"/>
+          <w:color w:val="000000"/>
           <w:sz w:val="24"/>
         </w:rPr>
-        <w:t>[Ejecutar CP-02, CP-03, CP-05, CP-06 y CP-08 en el asistente desplegado y sustituir «[Pendiente]» por Pasa / No pasa.]</w:t>
+        <w:t>Resultado: ocho casos pasan, uno pasa con observación y uno no pasa. Todo lo que depende de reglas y cifras pasa porque no lo decide el modelo. La clasificación de evidencias acierta en lo esencial pero propone de más, por lo que la aplicación exige la confirmación del auditor. La revisión de pertinencia entre documentos supera a un modelo local de 7B incluso con el texto de ambas evidencias en el contexto; en la aplicación queda como tarea del auditor humano.</w:t>
+      </w:r>
+    </w:p>
+    <w:p>
+      <w:pPr>
+        <w:pStyle w:val="Heading2"/>
+      </w:pPr>
+      <w:r>
+        <w:rPr>
+          <w:rFonts w:ascii="Times New Roman" w:hAnsi="Times New Roman" w:eastAsia="Times New Roman"/>
+          <w:b/>
+          <w:i w:val="0"/>
+          <w:color w:val="000000"/>
+          <w:sz w:val="24"/>
+        </w:rPr>
+        <w:t>8.5. Rendimiento</w:t>
+      </w:r>
+    </w:p>
+    <w:p>
+      <w:pPr>
+        <w:spacing w:after="120"/>
+        <w:ind w:left="0"/>
+        <w:jc w:val="both"/>
+      </w:pPr>
+      <w:r>
+        <w:rPr>
+          <w:rFonts w:ascii="Times New Roman" w:hAnsi="Times New Roman" w:eastAsia="Times New Roman"/>
+          <w:b w:val="0"/>
+          <w:i w:val="0"/>
+          <w:color w:val="000000"/>
+          <w:sz w:val="24"/>
+        </w:rPr>
+        <w:t>En un portátil con GPU RTX 4060 de 8 GB y 16 GB de RAM, el modelo genera unos 24 tokens por segundo. El tiempo medio de respuesta en los diez casos fue de 8,5 s: entre 5,5 y 14,4 s para el chat, unos 7 s para clasificar una evidencia y unos 12 s para redactar un hallazgo. Construir el índice FAISS de 60 fragmentos toma unos segundos y solo se repite cuando cambia el conocimiento.</w:t>
       </w:r>
     </w:p>
     <w:p>
@@ -7907,7 +10102,7 @@
           <w:color w:val="000000"/>
           <w:sz w:val="24"/>
         </w:rPr>
-        <w:t>Separar el cálculo (script) del juicio (modelo) elimina los errores aritméticos y la alucinación de evidencia, y deja al modelo lo que aporta valor: en la prueba detectó dos controles que el cálculo automático daba por cubiertos sin serlo.</w:t>
+        <w:t>Separar el cálculo del juicio es aún más importante con un modelo local pequeño: cada error observado en las pruebas desapareció al pasar esa parte al código, y los ocho casos que dependen de reglas, cifras o conocimiento recuperado pasan.</w:t>
       </w:r>
     </w:p>
     <w:p>
@@ -7951,7 +10146,7 @@
           <w:color w:val="000000"/>
           <w:sz w:val="24"/>
         </w:rPr>
-        <w:t>La descripción del SKILL.md funciona como disparador de activación, y la identidad, las instrucciones y el conocimiento del asistente le dan un comportamiento estable y acotado a su rol.</w:t>
+        <w:t>El RAG con embeddings locales y FAISS da al asistente un conocimiento verificable y citable; sin él, el modelo inventó incluso el significado de PIMS.</w:t>
       </w:r>
     </w:p>
     <w:p>
@@ -7973,7 +10168,29 @@
           <w:color w:val="000000"/>
           <w:sz w:val="24"/>
         </w:rPr>
-        <w:t>El resultado es una skill funcional especializada que ya produce la matriz de cobertura y los hallazgos preliminares de una auditoría interna del PIMS.</w:t>
+        <w:t>Ejecutar el servidor, los modelos y el índice en la máquina del auditor permite trabajar con evidencias que contienen datos personales sin enviarlas a terceros.</w:t>
+      </w:r>
+    </w:p>
+    <w:p>
+      <w:pPr>
+        <w:pStyle w:val="ListNumber"/>
+        <w:spacing w:after="60" w:line="240" w:lineRule="auto"/>
+        <w:ind w:left="624" w:hanging="340"/>
+        <w:jc w:val="both"/>
+        <w:numPr>
+          <w:ilvl w:val="0"/>
+          <w:numId w:val="12"/>
+        </w:numPr>
+      </w:pPr>
+      <w:r>
+        <w:rPr>
+          <w:rFonts w:ascii="Times New Roman" w:hAnsi="Times New Roman" w:eastAsia="Times New Roman"/>
+          <w:b w:val="0"/>
+          <w:i w:val="0"/>
+          <w:color w:val="000000"/>
+          <w:sz w:val="24"/>
+        </w:rPr>
+        <w:t>La revisión de pertinencia entre documentos sigue requiriendo al auditor humano con un modelo de 7B; el diseño con propuesta y confirmación lo garantiza.</w:t>
       </w:r>
     </w:p>
     <w:p>
@@ -8006,7 +10223,7 @@
           <w:color w:val="000000"/>
           <w:sz w:val="24"/>
         </w:rPr>
-        <w:t>Diseño del agente: objetivo, datos (tabla evidence_store en PostgreSQL), contexto y herramientas expuestas como servidor MCP (store_evidence, verify_evidence, generate_audit_report).</w:t>
+        <w:t>Diseño del agente: objetivo, datos (tabla evidence_store en PostgreSQL), contexto y herramientas expuestas como servidor MCP (store_evidence, verify_evidence, generate_audit_report) a partir de las rutas actuales de la aplicación.</w:t>
       </w:r>
     </w:p>
     <w:p>
@@ -8042,7 +10259,7 @@
           <w:color w:val="000000"/>
           <w:sz w:val="24"/>
         </w:rPr>
-        <w:t>Proyecto agéntico: integración con el panel de aprobación humana para que el auditor valide los hallazgos.</w:t>
+        <w:t>Proyecto agéntico: integrar el panel de aprobación humana y evaluar un modelo local mayor para la revisión de pertinencia.</w:t>
       </w:r>
     </w:p>
     <w:p>
@@ -8111,6 +10328,80 @@
           <w:color w:val="000000"/>
           <w:sz w:val="24"/>
         </w:rPr>
+        <w:t xml:space="preserve">Congreso de la República del Perú. (2011). </w:t>
+      </w:r>
+      <w:r>
+        <w:rPr>
+          <w:rFonts w:ascii="Times New Roman" w:hAnsi="Times New Roman" w:eastAsia="Times New Roman"/>
+          <w:b w:val="0"/>
+          <w:i/>
+          <w:color w:val="000000"/>
+          <w:sz w:val="24"/>
+        </w:rPr>
+        <w:t>Ley N.º 29733, Ley de Protección de Datos Personales</w:t>
+      </w:r>
+      <w:r>
+        <w:rPr>
+          <w:rFonts w:ascii="Times New Roman" w:hAnsi="Times New Roman" w:eastAsia="Times New Roman"/>
+          <w:b w:val="0"/>
+          <w:i w:val="0"/>
+          <w:color w:val="000000"/>
+          <w:sz w:val="24"/>
+        </w:rPr>
+        <w:t>.</w:t>
+      </w:r>
+    </w:p>
+    <w:p>
+      <w:pPr>
+        <w:spacing w:after="120"/>
+        <w:ind w:left="0"/>
+        <w:jc w:val="both"/>
+      </w:pPr>
+      <w:r>
+        <w:rPr>
+          <w:rFonts w:ascii="Times New Roman" w:hAnsi="Times New Roman" w:eastAsia="Times New Roman"/>
+          <w:b w:val="0"/>
+          <w:i w:val="0"/>
+          <w:color w:val="000000"/>
+          <w:sz w:val="24"/>
+        </w:rPr>
+        <w:t xml:space="preserve">Douze, M., Guzhva, A., Deng, C., Johnson, J., Szilvasy, G., Mazaré, P.-E., Lomeli, M., Hosseini, L. y Jégou, H. (2024). </w:t>
+      </w:r>
+      <w:r>
+        <w:rPr>
+          <w:rFonts w:ascii="Times New Roman" w:hAnsi="Times New Roman" w:eastAsia="Times New Roman"/>
+          <w:b w:val="0"/>
+          <w:i/>
+          <w:color w:val="000000"/>
+          <w:sz w:val="24"/>
+        </w:rPr>
+        <w:t>The Faiss library</w:t>
+      </w:r>
+      <w:r>
+        <w:rPr>
+          <w:rFonts w:ascii="Times New Roman" w:hAnsi="Times New Roman" w:eastAsia="Times New Roman"/>
+          <w:b w:val="0"/>
+          <w:i w:val="0"/>
+          <w:color w:val="000000"/>
+          <w:sz w:val="24"/>
+        </w:rPr>
+        <w:t>. arXiv:2401.08281.</w:t>
+      </w:r>
+    </w:p>
+    <w:p>
+      <w:pPr>
+        <w:spacing w:after="120"/>
+        <w:ind w:left="0"/>
+        <w:jc w:val="both"/>
+      </w:pPr>
+      <w:r>
+        <w:rPr>
+          <w:rFonts w:ascii="Times New Roman" w:hAnsi="Times New Roman" w:eastAsia="Times New Roman"/>
+          <w:b w:val="0"/>
+          <w:i w:val="0"/>
+          <w:color w:val="000000"/>
+          <w:sz w:val="24"/>
+        </w:rPr>
         <w:t xml:space="preserve">International Organization for Standardization. (2018). </w:t>
       </w:r>
       <w:r>
@@ -8185,7 +10476,7 @@
           <w:color w:val="000000"/>
           <w:sz w:val="24"/>
         </w:rPr>
-        <w:t xml:space="preserve">Congreso de la República del Perú. (2011). </w:t>
+        <w:t xml:space="preserve">ISMS.online. (2025). </w:t>
       </w:r>
       <w:r>
         <w:rPr>
@@ -8195,7 +10486,44 @@
           <w:color w:val="000000"/>
           <w:sz w:val="24"/>
         </w:rPr>
-        <w:t>Ley N.º 29733, Ley de Protección de Datos Personales</w:t>
+        <w:t>ISO 27701 Annex A controls: Complete guide</w:t>
+      </w:r>
+      <w:r>
+        <w:rPr>
+          <w:rFonts w:ascii="Times New Roman" w:hAnsi="Times New Roman" w:eastAsia="Times New Roman"/>
+          <w:b w:val="0"/>
+          <w:i w:val="0"/>
+          <w:color w:val="000000"/>
+          <w:sz w:val="24"/>
+        </w:rPr>
+        <w:t>. https://www.isms.online/iso-27701/annex-a-2025/</w:t>
+      </w:r>
+    </w:p>
+    <w:p>
+      <w:pPr>
+        <w:spacing w:after="120"/>
+        <w:ind w:left="0"/>
+        <w:jc w:val="both"/>
+      </w:pPr>
+      <w:r>
+        <w:rPr>
+          <w:rFonts w:ascii="Times New Roman" w:hAnsi="Times New Roman" w:eastAsia="Times New Roman"/>
+          <w:b w:val="0"/>
+          <w:i w:val="0"/>
+          <w:color w:val="000000"/>
+          <w:sz w:val="24"/>
+        </w:rPr>
+        <w:t xml:space="preserve">Lewis, P., Perez, E., Piktus, A. et al. (2020). Retrieval-augmented generation for knowledge-intensive NLP tasks. </w:t>
+      </w:r>
+      <w:r>
+        <w:rPr>
+          <w:rFonts w:ascii="Times New Roman" w:hAnsi="Times New Roman" w:eastAsia="Times New Roman"/>
+          <w:b w:val="0"/>
+          <w:i/>
+          <w:color w:val="000000"/>
+          <w:sz w:val="24"/>
+        </w:rPr>
+        <w:t>Advances in Neural Information Processing Systems, 33</w:t>
       </w:r>
       <w:r>
         <w:rPr>
@@ -8206,6 +10534,43 @@
           <w:sz w:val="24"/>
         </w:rPr>
         <w:t>.</w:t>
+      </w:r>
+    </w:p>
+    <w:p>
+      <w:pPr>
+        <w:spacing w:after="120"/>
+        <w:ind w:left="0"/>
+        <w:jc w:val="both"/>
+      </w:pPr>
+      <w:r>
+        <w:rPr>
+          <w:rFonts w:ascii="Times New Roman" w:hAnsi="Times New Roman" w:eastAsia="Times New Roman"/>
+          <w:b w:val="0"/>
+          <w:i w:val="0"/>
+          <w:color w:val="000000"/>
+          <w:sz w:val="24"/>
+        </w:rPr>
+        <w:t xml:space="preserve">Material del curso Auditoría de Sistemas. (2026). </w:t>
+      </w:r>
+      <w:r>
+        <w:rPr>
+          <w:rFonts w:ascii="Times New Roman" w:hAnsi="Times New Roman" w:eastAsia="Times New Roman"/>
+          <w:b w:val="0"/>
+          <w:i/>
+          <w:color w:val="000000"/>
+          <w:sz w:val="24"/>
+        </w:rPr>
+        <w:t>Guía: IA agéntica, sistemas multiagente y PIMS multiagente basado en ISO/IEC 27701:2025</w:t>
+      </w:r>
+      <w:r>
+        <w:rPr>
+          <w:rFonts w:ascii="Times New Roman" w:hAnsi="Times New Roman" w:eastAsia="Times New Roman"/>
+          <w:b w:val="0"/>
+          <w:i w:val="0"/>
+          <w:color w:val="000000"/>
+          <w:sz w:val="24"/>
+        </w:rPr>
+        <w:t xml:space="preserve"> [Conversación guía entregada por el docente].</w:t>
       </w:r>
     </w:p>
     <w:p>
@@ -8296,7 +10661,7 @@
           <w:color w:val="000000"/>
           <w:sz w:val="24"/>
         </w:rPr>
-        <w:t xml:space="preserve">ISMS.online. (2025). </w:t>
+        <w:t xml:space="preserve">Nussbaum, Z., Morris, J. X., Duderstadt, B. y Mulyar, A. (2024). </w:t>
       </w:r>
       <w:r>
         <w:rPr>
@@ -8306,7 +10671,7 @@
           <w:color w:val="000000"/>
           <w:sz w:val="24"/>
         </w:rPr>
-        <w:t>ISO 27701 Annex A controls: Complete guide</w:t>
+        <w:t>Nomic Embed: Training a reproducible long context text embedder</w:t>
       </w:r>
       <w:r>
         <w:rPr>
@@ -8316,7 +10681,7 @@
           <w:color w:val="000000"/>
           <w:sz w:val="24"/>
         </w:rPr>
-        <w:t>. https://www.isms.online/iso-27701/annex-a-2025/</w:t>
+        <w:t>. arXiv:2402.01613.</w:t>
       </w:r>
     </w:p>
     <w:p>
@@ -8333,7 +10698,7 @@
           <w:color w:val="000000"/>
           <w:sz w:val="24"/>
         </w:rPr>
-        <w:t xml:space="preserve">Material del curso Auditoría de Sistemas. (2026). </w:t>
+        <w:t xml:space="preserve">Ollama. (2026). </w:t>
       </w:r>
       <w:r>
         <w:rPr>
@@ -8343,7 +10708,7 @@
           <w:color w:val="000000"/>
           <w:sz w:val="24"/>
         </w:rPr>
-        <w:t>Guía: IA agéntica, sistemas multiagente y PIMS multiagente basado en ISO/IEC 27701:2025</w:t>
+        <w:t>Ollama</w:t>
       </w:r>
       <w:r>
         <w:rPr>
@@ -8353,7 +10718,81 @@
           <w:color w:val="000000"/>
           <w:sz w:val="24"/>
         </w:rPr>
-        <w:t xml:space="preserve"> [Conversación guía entregada por el docente].</w:t>
+        <w:t xml:space="preserve"> [Software]. https://ollama.com</w:t>
+      </w:r>
+    </w:p>
+    <w:p>
+      <w:pPr>
+        <w:spacing w:after="120"/>
+        <w:ind w:left="0"/>
+        <w:jc w:val="both"/>
+      </w:pPr>
+      <w:r>
+        <w:rPr>
+          <w:rFonts w:ascii="Times New Roman" w:hAnsi="Times New Roman" w:eastAsia="Times New Roman"/>
+          <w:b w:val="0"/>
+          <w:i w:val="0"/>
+          <w:color w:val="000000"/>
+          <w:sz w:val="24"/>
+        </w:rPr>
+        <w:t xml:space="preserve">Pallets Projects. (2026). </w:t>
+      </w:r>
+      <w:r>
+        <w:rPr>
+          <w:rFonts w:ascii="Times New Roman" w:hAnsi="Times New Roman" w:eastAsia="Times New Roman"/>
+          <w:b w:val="0"/>
+          <w:i/>
+          <w:color w:val="000000"/>
+          <w:sz w:val="24"/>
+        </w:rPr>
+        <w:t>Flask documentation</w:t>
+      </w:r>
+      <w:r>
+        <w:rPr>
+          <w:rFonts w:ascii="Times New Roman" w:hAnsi="Times New Roman" w:eastAsia="Times New Roman"/>
+          <w:b w:val="0"/>
+          <w:i w:val="0"/>
+          <w:color w:val="000000"/>
+          <w:sz w:val="24"/>
+        </w:rPr>
+        <w:t>. https://flask.palletsprojects.com</w:t>
+      </w:r>
+    </w:p>
+    <w:p>
+      <w:pPr>
+        <w:spacing w:after="120"/>
+        <w:ind w:left="0"/>
+        <w:jc w:val="both"/>
+      </w:pPr>
+      <w:r>
+        <w:rPr>
+          <w:rFonts w:ascii="Times New Roman" w:hAnsi="Times New Roman" w:eastAsia="Times New Roman"/>
+          <w:b w:val="0"/>
+          <w:i w:val="0"/>
+          <w:color w:val="000000"/>
+          <w:sz w:val="24"/>
+        </w:rPr>
+        <w:t xml:space="preserve">Qwen Team. (2024). </w:t>
+      </w:r>
+      <w:r>
+        <w:rPr>
+          <w:rFonts w:ascii="Times New Roman" w:hAnsi="Times New Roman" w:eastAsia="Times New Roman"/>
+          <w:b w:val="0"/>
+          <w:i/>
+          <w:color w:val="000000"/>
+          <w:sz w:val="24"/>
+        </w:rPr>
+        <w:t>Qwen2.5 technical report</w:t>
+      </w:r>
+      <w:r>
+        <w:rPr>
+          <w:rFonts w:ascii="Times New Roman" w:hAnsi="Times New Roman" w:eastAsia="Times New Roman"/>
+          <w:b w:val="0"/>
+          <w:i w:val="0"/>
+          <w:color w:val="000000"/>
+          <w:sz w:val="24"/>
+        </w:rPr>
+        <w:t>. arXiv:2412.15115.</w:t>
       </w:r>
     </w:p>
     <w:p>
@@ -8526,7 +10965,75 @@
           <w:color w:val="000000"/>
           <w:sz w:val="24"/>
         </w:rPr>
-        <w:t xml:space="preserve">    casos_prueba.md</w:t>
+        <w:t xml:space="preserve">    casos_prueba.md, pruebas/</w:t>
+      </w:r>
+    </w:p>
+    <w:p>
+      <w:pPr>
+        <w:spacing w:after="0"/>
+        <w:ind w:left="283"/>
+        <w:jc w:val="left"/>
+      </w:pPr>
+      <w:r>
+        <w:rPr>
+          <w:rFonts w:ascii="Courier New" w:hAnsi="Courier New" w:eastAsia="Courier New"/>
+          <w:b w:val="0"/>
+          <w:i w:val="0"/>
+          <w:color w:val="000000"/>
+          <w:sz w:val="24"/>
+        </w:rPr>
+        <w:t xml:space="preserve">  04-aplicacion/</w:t>
+      </w:r>
+    </w:p>
+    <w:p>
+      <w:pPr>
+        <w:spacing w:after="0"/>
+        <w:ind w:left="283"/>
+        <w:jc w:val="left"/>
+      </w:pPr>
+      <w:r>
+        <w:rPr>
+          <w:rFonts w:ascii="Courier New" w:hAnsi="Courier New" w:eastAsia="Courier New"/>
+          <w:b w:val="0"/>
+          <w:i w:val="0"/>
+          <w:color w:val="000000"/>
+          <w:sz w:val="24"/>
+        </w:rPr>
+        <w:t xml:space="preserve">    app.py, asistente.py, rag.py, llm_local.py</w:t>
+      </w:r>
+    </w:p>
+    <w:p>
+      <w:pPr>
+        <w:spacing w:after="0"/>
+        <w:ind w:left="283"/>
+        <w:jc w:val="left"/>
+      </w:pPr>
+      <w:r>
+        <w:rPr>
+          <w:rFonts w:ascii="Courier New" w:hAnsi="Courier New" w:eastAsia="Courier New"/>
+          <w:b w:val="0"/>
+          <w:i w:val="0"/>
+          <w:color w:val="000000"/>
+          <w:sz w:val="24"/>
+        </w:rPr>
+        <w:t xml:space="preserve">    templates/index.html</w:t>
+      </w:r>
+    </w:p>
+    <w:p>
+      <w:pPr>
+        <w:spacing w:after="0"/>
+        <w:ind w:left="283"/>
+        <w:jc w:val="left"/>
+      </w:pPr>
+      <w:r>
+        <w:rPr>
+          <w:rFonts w:ascii="Courier New" w:hAnsi="Courier New" w:eastAsia="Courier New"/>
+          <w:b w:val="0"/>
+          <w:i w:val="0"/>
+          <w:color w:val="000000"/>
+          <w:sz w:val="24"/>
+        </w:rPr>
+        <w:t xml:space="preserve">    static/estilos.css, static/app.js</w:t>
       </w:r>
     </w:p>
     <w:p>
@@ -8560,7 +11067,7 @@
           <w:color w:val="000000"/>
           <w:sz w:val="24"/>
         </w:rPr>
-        <w:t xml:space="preserve">    generar_informe.py, docx_builder.py, figuras/</w:t>
+        <w:t xml:space="preserve">    generar_informe.py, figuras/</w:t>
       </w:r>
     </w:p>
     <w:p>
@@ -8597,7 +11104,129 @@
           <w:color w:val="000000"/>
           <w:sz w:val="24"/>
         </w:rPr>
-        <w:t>Anexo B. Cómo reproducir la demostración</w:t>
+        <w:t>Anexo B. Instalación y ejecución</w:t>
+      </w:r>
+    </w:p>
+    <w:p>
+      <w:pPr>
+        <w:spacing w:after="0"/>
+        <w:ind w:left="283"/>
+        <w:jc w:val="left"/>
+      </w:pPr>
+      <w:r>
+        <w:rPr>
+          <w:rFonts w:ascii="Courier New" w:hAnsi="Courier New" w:eastAsia="Courier New"/>
+          <w:b w:val="0"/>
+          <w:i w:val="0"/>
+          <w:color w:val="000000"/>
+          <w:sz w:val="24"/>
+        </w:rPr>
+        <w:t>ollama pull nomic-embed-text</w:t>
+      </w:r>
+    </w:p>
+    <w:p>
+      <w:pPr>
+        <w:spacing w:after="0"/>
+        <w:ind w:left="283"/>
+        <w:jc w:val="left"/>
+      </w:pPr>
+      <w:r>
+        <w:rPr>
+          <w:rFonts w:ascii="Courier New" w:hAnsi="Courier New" w:eastAsia="Courier New"/>
+          <w:b w:val="0"/>
+          <w:i w:val="0"/>
+          <w:color w:val="000000"/>
+          <w:sz w:val="24"/>
+        </w:rPr>
+        <w:t>ollama pull qwen2.5:7b</w:t>
+      </w:r>
+    </w:p>
+    <w:p>
+      <w:pPr>
+        <w:spacing w:after="0"/>
+        <w:ind w:left="283"/>
+        <w:jc w:val="left"/>
+      </w:pPr>
+      <w:r>
+        <w:rPr>
+          <w:rFonts w:ascii="Courier New" w:hAnsi="Courier New" w:eastAsia="Courier New"/>
+          <w:b w:val="0"/>
+          <w:i w:val="0"/>
+          <w:color w:val="000000"/>
+          <w:sz w:val="24"/>
+        </w:rPr>
+        <w:t>cd 04-aplicacion</w:t>
+      </w:r>
+    </w:p>
+    <w:p>
+      <w:pPr>
+        <w:spacing w:after="0"/>
+        <w:ind w:left="283"/>
+        <w:jc w:val="left"/>
+      </w:pPr>
+      <w:r>
+        <w:rPr>
+          <w:rFonts w:ascii="Courier New" w:hAnsi="Courier New" w:eastAsia="Courier New"/>
+          <w:b w:val="0"/>
+          <w:i w:val="0"/>
+          <w:color w:val="000000"/>
+          <w:sz w:val="24"/>
+        </w:rPr>
+        <w:t>pip install -r requirements.txt</w:t>
+      </w:r>
+    </w:p>
+    <w:p>
+      <w:pPr>
+        <w:spacing w:after="0"/>
+        <w:ind w:left="283"/>
+        <w:jc w:val="left"/>
+      </w:pPr>
+      <w:r>
+        <w:rPr>
+          <w:rFonts w:ascii="Courier New" w:hAnsi="Courier New" w:eastAsia="Courier New"/>
+          <w:b w:val="0"/>
+          <w:i w:val="0"/>
+          <w:color w:val="000000"/>
+          <w:sz w:val="24"/>
+        </w:rPr>
+        <w:t>python cargar_demo.py</w:t>
+      </w:r>
+    </w:p>
+    <w:p>
+      <w:pPr>
+        <w:spacing w:after="0"/>
+        <w:ind w:left="283"/>
+        <w:jc w:val="left"/>
+      </w:pPr>
+      <w:r>
+        <w:rPr>
+          <w:rFonts w:ascii="Courier New" w:hAnsi="Courier New" w:eastAsia="Courier New"/>
+          <w:b w:val="0"/>
+          <w:i w:val="0"/>
+          <w:color w:val="000000"/>
+          <w:sz w:val="24"/>
+        </w:rPr>
+        <w:t>python app.py      # http://127.0.0.1:5000</w:t>
+      </w:r>
+    </w:p>
+    <w:p>
+      <w:pPr>
+        <w:spacing w:before="0" w:after="0" w:line="120" w:lineRule="exact"/>
+      </w:pPr>
+    </w:p>
+    <w:p>
+      <w:pPr>
+        <w:pStyle w:val="Heading1"/>
+      </w:pPr>
+      <w:r>
+        <w:rPr>
+          <w:rFonts w:ascii="Times New Roman" w:hAnsi="Times New Roman" w:eastAsia="Times New Roman"/>
+          <w:b/>
+          <w:i w:val="0"/>
+          <w:color w:val="000000"/>
+          <w:sz w:val="24"/>
+        </w:rPr>
+        <w:t>Anexo C. Reproducir las pruebas</w:t>
       </w:r>
     </w:p>
     <w:p>
@@ -8648,7 +11277,7 @@
           <w:color w:val="000000"/>
           <w:sz w:val="24"/>
         </w:rPr>
-        <w:t># salida en salida/: consola_demo.txt,</w:t>
+        <w:t>cd ../../../..</w:t>
       </w:r>
     </w:p>
     <w:p>
@@ -8665,7 +11294,7 @@
           <w:color w:val="000000"/>
           <w:sz w:val="24"/>
         </w:rPr>
-        <w:t>#   informe_cobertura.md e informe_cobertura.json</w:t>
+        <w:t>python 03-asistente/pruebas/correr_casos.py</w:t>
       </w:r>
     </w:p>
     <w:p>

</xml_diff>